<commit_message>
HRD-010 step 5 fix: register HRD-085..HRD-090 (queue repository stubs)
Task 5 commit fc9ca3d introduced commons_infra/task_repository.go with 16
stub methods that return error messages referencing HRD-085..HRD-090.
Those HRD numbers were not registered in Issues.md — a §11.4.74
catalogue-check trap: code shipped references to nonexistent issues.

This commit closes the gap by adding 6 HRD rows to Issues.md covering
the queue-repository surface areas Herald does not yet exercise on the
Enqueue/Dequeue hot path. Each row carries the upstream
digital.vasic.background.TaskRepository interface as its
Catalogue-Check anchor (extend, not reimplement).

Issues.md r4 → r5. Total open HRDs: 45 → 52 (HRD-081 was previously
omitted from the header enumeration; r5 reincludes it alongside the
6 new rows).

Caught by Task 5 spec compliance review.

Co-Authored-By: Claude Opus 4.7 <noreply@anthropic.com>
</commit_message>
<xml_diff>
--- a/docs/Issues.docx
+++ b/docs/Issues.docx
@@ -10,7 +10,33 @@
         <w:t xml:space="preserve">Herald — Issues</w:t>
       </w:r>
     </w:p>
-    <w:bookmarkStart w:id="15" w:name="herald--issues"/>
+    <w:sdt>
+      <w:sdtPr>
+        <w:docPartObj>
+          <w:docPartGallery w:val="Table of Contents"/>
+          <w:docPartUnique/>
+        </w:docPartObj>
+      </w:sdtPr>
+      <w:sdtContent>
+        <w:p>
+          <w:pPr>
+            <w:pStyle w:val="TOCHeading"/>
+          </w:pPr>
+          <w:r>
+            <w:t xml:space="preserve">Table of Contents</w:t>
+          </w:r>
+        </w:p>
+        <w:p>
+          <w:r>
+            <w:fldChar w:fldCharType="begin" w:dirty="true"/>
+            <w:instrText xml:space="preserve">TOC \o "1-3" \h \z \u</w:instrText>
+            <w:fldChar w:fldCharType="separate"/>
+            <w:fldChar w:fldCharType="end"/>
+          </w:r>
+        </w:p>
+      </w:sdtContent>
+    </w:sdt>
+    <w:bookmarkStart w:id="15" w:name="herald-issues"/>
     <w:p>
       <w:pPr>
         <w:pStyle w:val="Heading1"/>
@@ -22,7 +48,8 @@
     <w:tbl>
       <w:tblPr>
         <w:tblStyle w:val="Table"/>
-        <w:tblW w:type="auto" w:w="0"/>
+        <w:tblW w:type="pct" w:w="5000"/>
+        <w:tblLayout w:type="fixed"/>
         <w:tblLook w:firstRow="1" w:lastRow="0" w:firstColumn="0" w:lastColumn="0" w:noHBand="0" w:noVBand="0" w:val="0020"/>
       </w:tblPr>
       <w:tblGrid>
@@ -75,7 +102,7 @@
               <w:pStyle w:val="Compact"/>
             </w:pPr>
             <w:r>
-              <w:t xml:space="preserve">4</w:t>
+              <w:t xml:space="preserve">5</w:t>
             </w:r>
           </w:p>
         </w:tc>
@@ -171,7 +198,37 @@
               <w:pStyle w:val="Compact"/>
             </w:pPr>
             <w:r>
-              <w:t xml:space="preserve">Spec V3 r6 adds §43 Constitution-derived flavor commands + workflows (27 entries). HRD-029..HRD-056 opened to track each command's implementation. Combined with HRD-018..HRD-028 from r5, the constitution-flavor integration plan now spans 39 workable items rolled out in 4 implementation waves.</w:t>
+              <w:t xml:space="preserve">Spec V3 r6 adds §43 Constitution-derived flavor commands + workflows (27 entries). HRD-029..HRD-056 opened to track each command’s implementation. Combined with HRD-018..HRD-028 from r5, the constitution-flavor integration plan now spans 39 workable items rolled out in 4 implementation waves. r5: HRD-085..HRD-090 opened to track the 16 stub methods in</w:t>
+            </w:r>
+            <w:r>
+              <w:t xml:space="preserve"> </w:t>
+            </w:r>
+            <w:r>
+              <w:rPr>
+                <w:rStyle w:val="VerbatimChar"/>
+              </w:rPr>
+              <w:t xml:space="preserve">commons_infra.pgxTaskRepository</w:t>
+            </w:r>
+            <w:r>
+              <w:t xml:space="preserve"> </w:t>
+            </w:r>
+            <w:r>
+              <w:t xml:space="preserve">per §11.4.74 catalogue-check on the upstream</w:t>
+            </w:r>
+            <w:r>
+              <w:t xml:space="preserve"> </w:t>
+            </w:r>
+            <w:r>
+              <w:rPr>
+                <w:rStyle w:val="VerbatimChar"/>
+              </w:rPr>
+              <w:t xml:space="preserve">digital.vasic.background.TaskRepository</w:t>
+            </w:r>
+            <w:r>
+              <w:t xml:space="preserve"> </w:t>
+            </w:r>
+            <w:r>
+              <w:t xml:space="preserve">interface.</w:t>
             </w:r>
           </w:p>
         </w:tc>
@@ -195,7 +252,7 @@
               <w:pStyle w:val="Compact"/>
             </w:pPr>
             <w:r>
-              <w:t xml:space="preserve">HRD-008, HRD-010, HRD-011, HRD-012, HRD-015, HRD-016, HRD-018..HRD-028, HRD-029..HRD-056</w:t>
+              <w:t xml:space="preserve">HRD-008, HRD-010, HRD-011, HRD-012, HRD-015, HRD-016, HRD-018..HRD-028, HRD-029..HRD-056, HRD-081, HRD-085..HRD-090</w:t>
             </w:r>
           </w:p>
         </w:tc>
@@ -219,7 +276,7 @@
               <w:pStyle w:val="Compact"/>
             </w:pPr>
             <w:r>
-              <w:t xml:space="preserve">45 open / in-progress workable items across quickstart validation, live channel integrations, REST surface, the §42 binding rollout, and the §43 command-catalogue implementation.</w:t>
+              <w:t xml:space="preserve">52 open / in-progress workable items across quickstart validation, live channel integrations, REST surface, the §42 binding rollout, the §43 command-catalogue implementation, the §44 containers-runtime workaround, and the §44 queue-repository extension surface (HRD-081 was previously omitted from the header enumeration; r5 reincludes it).</w:t>
             </w:r>
           </w:p>
         </w:tc>
@@ -461,7 +518,8 @@
     <w:tbl>
       <w:tblPr>
         <w:tblStyle w:val="Table"/>
-        <w:tblW w:type="auto" w:w="0"/>
+        <w:tblW w:type="pct" w:w="5000"/>
+        <w:tblLayout w:type="fixed"/>
         <w:tblLook w:firstRow="1" w:lastRow="0" w:firstColumn="0" w:lastColumn="0" w:noHBand="0" w:noVBand="0" w:val="0020"/>
       </w:tblPr>
       <w:tblGrid>
@@ -1601,7 +1659,7 @@
               <w:t xml:space="preserve"> </w:t>
             </w:r>
             <w:r>
-              <w:t xml:space="preserve">CI/test bindings (§1, §11.4.2/.3/.4/.5/.7/.13/.14/.24/.27/.39/.43/.46/.48–.52/.67) — gate-result event emitters; integrates with the consuming project's CI workflow</w:t>
+              <w:t xml:space="preserve">CI/test bindings (§1, §11.4.2/.3/.4/.5/.7/.13/.14/.24/.27/.39/.43/.46/.48–.52/.67) — gate-result event emitters; integrates with the consuming project’s CI workflow</w:t>
             </w:r>
           </w:p>
         </w:tc>
@@ -3959,7 +4017,7 @@
               <w:pStyle w:val="Compact"/>
             </w:pPr>
             <w:r>
-              <w:t xml:space="preserve">spec §43.2 / §11.4.36; Catalogue-Check: extend constitution submodule's install_upstreams.sh</w:t>
+              <w:t xml:space="preserve">spec §43.2 / §11.4.36; Catalogue-Check: extend constitution submodule’s install_upstreams.sh</w:t>
             </w:r>
           </w:p>
         </w:tc>
@@ -5526,6 +5584,1353 @@
             </w:r>
             <w:r>
               <w:t xml:space="preserve">, TCP-probe used for healthcheck).</w:t>
+            </w:r>
+          </w:p>
+        </w:tc>
+      </w:tr>
+      <w:tr>
+        <w:tc>
+          <w:tcPr/>
+          <w:p>
+            <w:pPr>
+              <w:pStyle w:val="Compact"/>
+            </w:pPr>
+            <w:r>
+              <w:t xml:space="preserve">HRD-085</w:t>
+            </w:r>
+          </w:p>
+        </w:tc>
+        <w:tc>
+          <w:tcPr/>
+          <w:p>
+            <w:pPr>
+              <w:pStyle w:val="Compact"/>
+            </w:pPr>
+            <w:r>
+              <w:t xml:space="preserve">task</w:t>
+            </w:r>
+          </w:p>
+        </w:tc>
+        <w:tc>
+          <w:tcPr/>
+          <w:p>
+            <w:pPr>
+              <w:pStyle w:val="Compact"/>
+            </w:pPr>
+            <w:r>
+              <w:t xml:space="preserve">open</w:t>
+            </w:r>
+          </w:p>
+        </w:tc>
+        <w:tc>
+          <w:tcPr/>
+          <w:p>
+            <w:pPr>
+              <w:pStyle w:val="Compact"/>
+            </w:pPr>
+            <w:r>
+              <w:t xml:space="preserve">middle</w:t>
+            </w:r>
+          </w:p>
+        </w:tc>
+        <w:tc>
+          <w:tcPr/>
+          <w:p>
+            <w:pPr>
+              <w:pStyle w:val="Compact"/>
+            </w:pPr>
+            <w:r>
+              <w:t xml:space="preserve">Implement single-task admin operations on</w:t>
+            </w:r>
+            <w:r>
+              <w:t xml:space="preserve"> </w:t>
+            </w:r>
+            <w:r>
+              <w:rPr>
+                <w:rStyle w:val="VerbatimChar"/>
+              </w:rPr>
+              <w:t xml:space="preserve">commons_infra.pgxTaskRepository</w:t>
+            </w:r>
+            <w:r>
+              <w:t xml:space="preserve"> </w:t>
+            </w:r>
+            <w:r>
+              <w:t xml:space="preserve">—</w:t>
+            </w:r>
+            <w:r>
+              <w:t xml:space="preserve"> </w:t>
+            </w:r>
+            <w:r>
+              <w:rPr>
+                <w:rStyle w:val="VerbatimChar"/>
+              </w:rPr>
+              <w:t xml:space="preserve">GetByID</w:t>
+            </w:r>
+            <w:r>
+              <w:t xml:space="preserve">,</w:t>
+            </w:r>
+            <w:r>
+              <w:t xml:space="preserve"> </w:t>
+            </w:r>
+            <w:r>
+              <w:rPr>
+                <w:rStyle w:val="VerbatimChar"/>
+              </w:rPr>
+              <w:t xml:space="preserve">Update</w:t>
+            </w:r>
+            <w:r>
+              <w:t xml:space="preserve">,</w:t>
+            </w:r>
+            <w:r>
+              <w:t xml:space="preserve"> </w:t>
+            </w:r>
+            <w:r>
+              <w:rPr>
+                <w:rStyle w:val="VerbatimChar"/>
+              </w:rPr>
+              <w:t xml:space="preserve">Delete</w:t>
+            </w:r>
+            <w:r>
+              <w:t xml:space="preserve">. Required for Requeue + MoveToDeadLetter call chains and operator tooling. Currently all three return</w:t>
+            </w:r>
+            <w:r>
+              <w:t xml:space="preserve"> </w:t>
+            </w:r>
+            <w:r>
+              <w:rPr>
+                <w:rStyle w:val="VerbatimChar"/>
+              </w:rPr>
+              <w:t xml:space="preserve">ErrUnsupported (HRD-085)</w:t>
+            </w:r>
+            <w:r>
+              <w:t xml:space="preserve">. Scope: read one BackgroundTask row by ID; full-row Update including JSONB columns; soft- or hard-Delete decision per §107.</w:t>
+            </w:r>
+          </w:p>
+        </w:tc>
+        <w:tc>
+          <w:tcPr/>
+          <w:p>
+            <w:pPr>
+              <w:pStyle w:val="Compact"/>
+            </w:pPr>
+            <w:r>
+              <w:t xml:space="preserve">2026-05-20</w:t>
+            </w:r>
+          </w:p>
+        </w:tc>
+        <w:tc>
+          <w:tcPr/>
+          <w:p>
+            <w:pPr>
+              <w:pStyle w:val="Compact"/>
+            </w:pPr>
+            <w:r>
+              <w:t xml:space="preserve">2026-05-20</w:t>
+            </w:r>
+          </w:p>
+        </w:tc>
+        <w:tc>
+          <w:tcPr/>
+          <w:p>
+            <w:pPr>
+              <w:pStyle w:val="Compact"/>
+            </w:pPr>
+            <w:r>
+              <w:t xml:space="preserve">spec V3 §44 + upstream interface</w:t>
+            </w:r>
+            <w:r>
+              <w:t xml:space="preserve"> </w:t>
+            </w:r>
+            <w:r>
+              <w:rPr>
+                <w:rStyle w:val="VerbatimChar"/>
+              </w:rPr>
+              <w:t xml:space="preserve">TaskRepository</w:t>
+            </w:r>
+            <w:r>
+              <w:t xml:space="preserve"> </w:t>
+            </w:r>
+            <w:r>
+              <w:t xml:space="preserve">in</w:t>
+            </w:r>
+            <w:r>
+              <w:t xml:space="preserve"> </w:t>
+            </w:r>
+            <w:r>
+              <w:rPr>
+                <w:rStyle w:val="VerbatimChar"/>
+              </w:rPr>
+              <w:t xml:space="preserve">submodules/background/interfaces.go</w:t>
+            </w:r>
+            <w:r>
+              <w:t xml:space="preserve">; Catalogue-Check: extend</w:t>
+            </w:r>
+            <w:r>
+              <w:t xml:space="preserve"> </w:t>
+            </w:r>
+            <w:r>
+              <w:rPr>
+                <w:rStyle w:val="VerbatimChar"/>
+              </w:rPr>
+              <w:t xml:space="preserve">digital.vasic.background.TaskRepository@2d46dd60b2ffcb9d3b584b029b711a6fbc71b296</w:t>
+            </w:r>
+            <w:r>
+              <w:t xml:space="preserve"> </w:t>
+            </w:r>
+            <w:r>
+              <w:t xml:space="preserve">(Herald already implements Enqueue/Dequeue/LogEvent on the same interface; these three rows finish the single-task surface).</w:t>
+            </w:r>
+          </w:p>
+        </w:tc>
+      </w:tr>
+      <w:tr>
+        <w:tc>
+          <w:tcPr/>
+          <w:p>
+            <w:pPr>
+              <w:pStyle w:val="Compact"/>
+            </w:pPr>
+            <w:r>
+              <w:t xml:space="preserve">HRD-086</w:t>
+            </w:r>
+          </w:p>
+        </w:tc>
+        <w:tc>
+          <w:tcPr/>
+          <w:p>
+            <w:pPr>
+              <w:pStyle w:val="Compact"/>
+            </w:pPr>
+            <w:r>
+              <w:t xml:space="preserve">task</w:t>
+            </w:r>
+          </w:p>
+        </w:tc>
+        <w:tc>
+          <w:tcPr/>
+          <w:p>
+            <w:pPr>
+              <w:pStyle w:val="Compact"/>
+            </w:pPr>
+            <w:r>
+              <w:t xml:space="preserve">open</w:t>
+            </w:r>
+          </w:p>
+        </w:tc>
+        <w:tc>
+          <w:tcPr/>
+          <w:p>
+            <w:pPr>
+              <w:pStyle w:val="Compact"/>
+            </w:pPr>
+            <w:r>
+              <w:t xml:space="preserve">middle</w:t>
+            </w:r>
+          </w:p>
+        </w:tc>
+        <w:tc>
+          <w:tcPr/>
+          <w:p>
+            <w:pPr>
+              <w:pStyle w:val="Compact"/>
+            </w:pPr>
+            <w:r>
+              <w:t xml:space="preserve">Implement worker-side running-task state mutations on</w:t>
+            </w:r>
+            <w:r>
+              <w:t xml:space="preserve"> </w:t>
+            </w:r>
+            <w:r>
+              <w:rPr>
+                <w:rStyle w:val="VerbatimChar"/>
+              </w:rPr>
+              <w:t xml:space="preserve">commons_infra.pgxTaskRepository</w:t>
+            </w:r>
+            <w:r>
+              <w:t xml:space="preserve"> </w:t>
+            </w:r>
+            <w:r>
+              <w:t xml:space="preserve">—</w:t>
+            </w:r>
+            <w:r>
+              <w:t xml:space="preserve"> </w:t>
+            </w:r>
+            <w:r>
+              <w:rPr>
+                <w:rStyle w:val="VerbatimChar"/>
+              </w:rPr>
+              <w:t xml:space="preserve">UpdateStatus</w:t>
+            </w:r>
+            <w:r>
+              <w:t xml:space="preserve">,</w:t>
+            </w:r>
+            <w:r>
+              <w:t xml:space="preserve"> </w:t>
+            </w:r>
+            <w:r>
+              <w:rPr>
+                <w:rStyle w:val="VerbatimChar"/>
+              </w:rPr>
+              <w:t xml:space="preserve">UpdateProgress</w:t>
+            </w:r>
+            <w:r>
+              <w:t xml:space="preserve">,</w:t>
+            </w:r>
+            <w:r>
+              <w:t xml:space="preserve"> </w:t>
+            </w:r>
+            <w:r>
+              <w:rPr>
+                <w:rStyle w:val="VerbatimChar"/>
+              </w:rPr>
+              <w:t xml:space="preserve">UpdateHeartbeat</w:t>
+            </w:r>
+            <w:r>
+              <w:t xml:space="preserve">,</w:t>
+            </w:r>
+            <w:r>
+              <w:t xml:space="preserve"> </w:t>
+            </w:r>
+            <w:r>
+              <w:rPr>
+                <w:rStyle w:val="VerbatimChar"/>
+              </w:rPr>
+              <w:t xml:space="preserve">SaveCheckpoint</w:t>
+            </w:r>
+            <w:r>
+              <w:t xml:space="preserve">. Required by River workers + the stuck-detector reaper. Currently all four return</w:t>
+            </w:r>
+            <w:r>
+              <w:t xml:space="preserve"> </w:t>
+            </w:r>
+            <w:r>
+              <w:rPr>
+                <w:rStyle w:val="VerbatimChar"/>
+              </w:rPr>
+              <w:t xml:space="preserve">ErrUnsupported (HRD-086)</w:t>
+            </w:r>
+            <w:r>
+              <w:t xml:space="preserve">. Scope: status transitions guarded by valid-state-machine check; progress as</w:t>
+            </w:r>
+            <w:r>
+              <w:t xml:space="preserve"> </w:t>
+            </w:r>
+            <w:r>
+              <w:rPr>
+                <w:rStyle w:val="VerbatimChar"/>
+              </w:rPr>
+              <w:t xml:space="preserve">(float64, message)</w:t>
+            </w:r>
+            <w:r>
+              <w:t xml:space="preserve">; heartbeat as</w:t>
+            </w:r>
+            <w:r>
+              <w:t xml:space="preserve"> </w:t>
+            </w:r>
+            <w:r>
+              <w:rPr>
+                <w:rStyle w:val="VerbatimChar"/>
+              </w:rPr>
+              <w:t xml:space="preserve">updated_at = now()</w:t>
+            </w:r>
+            <w:r>
+              <w:t xml:space="preserve"> </w:t>
+            </w:r>
+            <w:r>
+              <w:t xml:space="preserve">writeback; checkpoint as opaque</w:t>
+            </w:r>
+            <w:r>
+              <w:t xml:space="preserve"> </w:t>
+            </w:r>
+            <w:r>
+              <w:rPr>
+                <w:rStyle w:val="VerbatimChar"/>
+              </w:rPr>
+              <w:t xml:space="preserve">[]byte</w:t>
+            </w:r>
+            <w:r>
+              <w:t xml:space="preserve"> </w:t>
+            </w:r>
+            <w:r>
+              <w:t xml:space="preserve">blob persisted alongside the task row.</w:t>
+            </w:r>
+          </w:p>
+        </w:tc>
+        <w:tc>
+          <w:tcPr/>
+          <w:p>
+            <w:pPr>
+              <w:pStyle w:val="Compact"/>
+            </w:pPr>
+            <w:r>
+              <w:t xml:space="preserve">2026-05-20</w:t>
+            </w:r>
+          </w:p>
+        </w:tc>
+        <w:tc>
+          <w:tcPr/>
+          <w:p>
+            <w:pPr>
+              <w:pStyle w:val="Compact"/>
+            </w:pPr>
+            <w:r>
+              <w:t xml:space="preserve">2026-05-20</w:t>
+            </w:r>
+          </w:p>
+        </w:tc>
+        <w:tc>
+          <w:tcPr/>
+          <w:p>
+            <w:pPr>
+              <w:pStyle w:val="Compact"/>
+            </w:pPr>
+            <w:r>
+              <w:t xml:space="preserve">spec V3 §44 + upstream interface</w:t>
+            </w:r>
+            <w:r>
+              <w:t xml:space="preserve"> </w:t>
+            </w:r>
+            <w:r>
+              <w:rPr>
+                <w:rStyle w:val="VerbatimChar"/>
+              </w:rPr>
+              <w:t xml:space="preserve">TaskRepository</w:t>
+            </w:r>
+            <w:r>
+              <w:t xml:space="preserve"> </w:t>
+            </w:r>
+            <w:r>
+              <w:t xml:space="preserve">in</w:t>
+            </w:r>
+            <w:r>
+              <w:t xml:space="preserve"> </w:t>
+            </w:r>
+            <w:r>
+              <w:rPr>
+                <w:rStyle w:val="VerbatimChar"/>
+              </w:rPr>
+              <w:t xml:space="preserve">submodules/background/interfaces.go</w:t>
+            </w:r>
+            <w:r>
+              <w:t xml:space="preserve">; Catalogue-Check: extend</w:t>
+            </w:r>
+            <w:r>
+              <w:t xml:space="preserve"> </w:t>
+            </w:r>
+            <w:r>
+              <w:rPr>
+                <w:rStyle w:val="VerbatimChar"/>
+              </w:rPr>
+              <w:t xml:space="preserve">digital.vasic.background.TaskRepository@2d46dd60b2ffcb9d3b584b029b711a6fbc71b296</w:t>
+            </w:r>
+            <w:r>
+              <w:t xml:space="preserve"> </w:t>
+            </w:r>
+            <w:r>
+              <w:t xml:space="preserve">(worker-side write surface — the hot path for long-running task progress reporting).</w:t>
+            </w:r>
+          </w:p>
+        </w:tc>
+      </w:tr>
+      <w:tr>
+        <w:tc>
+          <w:tcPr/>
+          <w:p>
+            <w:pPr>
+              <w:pStyle w:val="Compact"/>
+            </w:pPr>
+            <w:r>
+              <w:t xml:space="preserve">HRD-087</w:t>
+            </w:r>
+          </w:p>
+        </w:tc>
+        <w:tc>
+          <w:tcPr/>
+          <w:p>
+            <w:pPr>
+              <w:pStyle w:val="Compact"/>
+            </w:pPr>
+            <w:r>
+              <w:t xml:space="preserve">task</w:t>
+            </w:r>
+          </w:p>
+        </w:tc>
+        <w:tc>
+          <w:tcPr/>
+          <w:p>
+            <w:pPr>
+              <w:pStyle w:val="Compact"/>
+            </w:pPr>
+            <w:r>
+              <w:t xml:space="preserve">open</w:t>
+            </w:r>
+          </w:p>
+        </w:tc>
+        <w:tc>
+          <w:tcPr/>
+          <w:p>
+            <w:pPr>
+              <w:pStyle w:val="Compact"/>
+            </w:pPr>
+            <w:r>
+              <w:t xml:space="preserve">low</w:t>
+            </w:r>
+          </w:p>
+        </w:tc>
+        <w:tc>
+          <w:tcPr/>
+          <w:p>
+            <w:pPr>
+              <w:pStyle w:val="Compact"/>
+            </w:pPr>
+            <w:r>
+              <w:t xml:space="preserve">Implement admin / stats / audit reads on</w:t>
+            </w:r>
+            <w:r>
+              <w:t xml:space="preserve"> </w:t>
+            </w:r>
+            <w:r>
+              <w:rPr>
+                <w:rStyle w:val="VerbatimChar"/>
+              </w:rPr>
+              <w:t xml:space="preserve">commons_infra.pgxTaskRepository</w:t>
+            </w:r>
+            <w:r>
+              <w:t xml:space="preserve"> </w:t>
+            </w:r>
+            <w:r>
+              <w:t xml:space="preserve">—</w:t>
+            </w:r>
+            <w:r>
+              <w:t xml:space="preserve"> </w:t>
+            </w:r>
+            <w:r>
+              <w:rPr>
+                <w:rStyle w:val="VerbatimChar"/>
+              </w:rPr>
+              <w:t xml:space="preserve">GetByStatus</w:t>
+            </w:r>
+            <w:r>
+              <w:t xml:space="preserve">,</w:t>
+            </w:r>
+            <w:r>
+              <w:t xml:space="preserve"> </w:t>
+            </w:r>
+            <w:r>
+              <w:rPr>
+                <w:rStyle w:val="VerbatimChar"/>
+              </w:rPr>
+              <w:t xml:space="preserve">GetPendingTasks</w:t>
+            </w:r>
+            <w:r>
+              <w:t xml:space="preserve">,</w:t>
+            </w:r>
+            <w:r>
+              <w:t xml:space="preserve"> </w:t>
+            </w:r>
+            <w:r>
+              <w:rPr>
+                <w:rStyle w:val="VerbatimChar"/>
+              </w:rPr>
+              <w:t xml:space="preserve">CountByStatus</w:t>
+            </w:r>
+            <w:r>
+              <w:t xml:space="preserve">,</w:t>
+            </w:r>
+            <w:r>
+              <w:t xml:space="preserve"> </w:t>
+            </w:r>
+            <w:r>
+              <w:rPr>
+                <w:rStyle w:val="VerbatimChar"/>
+              </w:rPr>
+              <w:t xml:space="preserve">GetTaskHistory</w:t>
+            </w:r>
+            <w:r>
+              <w:t xml:space="preserve">. Drives the</w:t>
+            </w:r>
+            <w:r>
+              <w:t xml:space="preserve"> </w:t>
+            </w:r>
+            <w:r>
+              <w:rPr>
+                <w:rStyle w:val="VerbatimChar"/>
+              </w:rPr>
+              <w:t xml:space="preserve">/v1/queue/*</w:t>
+            </w:r>
+            <w:r>
+              <w:t xml:space="preserve"> </w:t>
+            </w:r>
+            <w:r>
+              <w:t xml:space="preserve">introspection endpoints + Peek delegate. Currently all four return</w:t>
+            </w:r>
+            <w:r>
+              <w:t xml:space="preserve"> </w:t>
+            </w:r>
+            <w:r>
+              <w:rPr>
+                <w:rStyle w:val="VerbatimChar"/>
+              </w:rPr>
+              <w:t xml:space="preserve">ErrUnsupported (HRD-087)</w:t>
+            </w:r>
+            <w:r>
+              <w:t xml:space="preserve">. Scope: status-filtered paginated reads; pending-task slice for Peek; status-bucketed counts; per-task execution-history rows from the</w:t>
+            </w:r>
+            <w:r>
+              <w:t xml:space="preserve"> </w:t>
+            </w:r>
+            <w:r>
+              <w:rPr>
+                <w:rStyle w:val="VerbatimChar"/>
+              </w:rPr>
+              <w:t xml:space="preserve">task_execution_history</w:t>
+            </w:r>
+            <w:r>
+              <w:t xml:space="preserve"> </w:t>
+            </w:r>
+            <w:r>
+              <w:t xml:space="preserve">table.</w:t>
+            </w:r>
+          </w:p>
+        </w:tc>
+        <w:tc>
+          <w:tcPr/>
+          <w:p>
+            <w:pPr>
+              <w:pStyle w:val="Compact"/>
+            </w:pPr>
+            <w:r>
+              <w:t xml:space="preserve">2026-05-20</w:t>
+            </w:r>
+          </w:p>
+        </w:tc>
+        <w:tc>
+          <w:tcPr/>
+          <w:p>
+            <w:pPr>
+              <w:pStyle w:val="Compact"/>
+            </w:pPr>
+            <w:r>
+              <w:t xml:space="preserve">2026-05-20</w:t>
+            </w:r>
+          </w:p>
+        </w:tc>
+        <w:tc>
+          <w:tcPr/>
+          <w:p>
+            <w:pPr>
+              <w:pStyle w:val="Compact"/>
+            </w:pPr>
+            <w:r>
+              <w:t xml:space="preserve">spec V3 §44 + upstream interface</w:t>
+            </w:r>
+            <w:r>
+              <w:t xml:space="preserve"> </w:t>
+            </w:r>
+            <w:r>
+              <w:rPr>
+                <w:rStyle w:val="VerbatimChar"/>
+              </w:rPr>
+              <w:t xml:space="preserve">TaskRepository</w:t>
+            </w:r>
+            <w:r>
+              <w:t xml:space="preserve"> </w:t>
+            </w:r>
+            <w:r>
+              <w:t xml:space="preserve">in</w:t>
+            </w:r>
+            <w:r>
+              <w:t xml:space="preserve"> </w:t>
+            </w:r>
+            <w:r>
+              <w:rPr>
+                <w:rStyle w:val="VerbatimChar"/>
+              </w:rPr>
+              <w:t xml:space="preserve">submodules/background/interfaces.go</w:t>
+            </w:r>
+            <w:r>
+              <w:t xml:space="preserve">; Catalogue-Check: extend</w:t>
+            </w:r>
+            <w:r>
+              <w:t xml:space="preserve"> </w:t>
+            </w:r>
+            <w:r>
+              <w:rPr>
+                <w:rStyle w:val="VerbatimChar"/>
+              </w:rPr>
+              <w:t xml:space="preserve">digital.vasic.background.TaskRepository@2d46dd60b2ffcb9d3b584b029b711a6fbc71b296</w:t>
+            </w:r>
+            <w:r>
+              <w:t xml:space="preserve"> </w:t>
+            </w:r>
+            <w:r>
+              <w:t xml:space="preserve">(read-only introspection — composes with HRD-016</w:t>
+            </w:r>
+            <w:r>
+              <w:t xml:space="preserve"> </w:t>
+            </w:r>
+            <w:r>
+              <w:rPr>
+                <w:rStyle w:val="VerbatimChar"/>
+              </w:rPr>
+              <w:t xml:space="preserve">/v1/queue/*</w:t>
+            </w:r>
+            <w:r>
+              <w:t xml:space="preserve"> </w:t>
+            </w:r>
+            <w:r>
+              <w:t xml:space="preserve">Gin handlers).</w:t>
+            </w:r>
+          </w:p>
+        </w:tc>
+      </w:tr>
+      <w:tr>
+        <w:tc>
+          <w:tcPr/>
+          <w:p>
+            <w:pPr>
+              <w:pStyle w:val="Compact"/>
+            </w:pPr>
+            <w:r>
+              <w:t xml:space="preserve">HRD-088</w:t>
+            </w:r>
+          </w:p>
+        </w:tc>
+        <w:tc>
+          <w:tcPr/>
+          <w:p>
+            <w:pPr>
+              <w:pStyle w:val="Compact"/>
+            </w:pPr>
+            <w:r>
+              <w:t xml:space="preserve">task</w:t>
+            </w:r>
+          </w:p>
+        </w:tc>
+        <w:tc>
+          <w:tcPr/>
+          <w:p>
+            <w:pPr>
+              <w:pStyle w:val="Compact"/>
+            </w:pPr>
+            <w:r>
+              <w:t xml:space="preserve">open</w:t>
+            </w:r>
+          </w:p>
+        </w:tc>
+        <w:tc>
+          <w:tcPr/>
+          <w:p>
+            <w:pPr>
+              <w:pStyle w:val="Compact"/>
+            </w:pPr>
+            <w:r>
+              <w:t xml:space="preserve">middle</w:t>
+            </w:r>
+          </w:p>
+        </w:tc>
+        <w:tc>
+          <w:tcPr/>
+          <w:p>
+            <w:pPr>
+              <w:pStyle w:val="Compact"/>
+            </w:pPr>
+            <w:r>
+              <w:t xml:space="preserve">Implement queue-recovery reads on</w:t>
+            </w:r>
+            <w:r>
+              <w:t xml:space="preserve"> </w:t>
+            </w:r>
+            <w:r>
+              <w:rPr>
+                <w:rStyle w:val="VerbatimChar"/>
+              </w:rPr>
+              <w:t xml:space="preserve">commons_infra.pgxTaskRepository</w:t>
+            </w:r>
+            <w:r>
+              <w:t xml:space="preserve"> </w:t>
+            </w:r>
+            <w:r>
+              <w:t xml:space="preserve">—</w:t>
+            </w:r>
+            <w:r>
+              <w:t xml:space="preserve"> </w:t>
+            </w:r>
+            <w:r>
+              <w:rPr>
+                <w:rStyle w:val="VerbatimChar"/>
+              </w:rPr>
+              <w:t xml:space="preserve">GetStaleTasks</w:t>
+            </w:r>
+            <w:r>
+              <w:t xml:space="preserve">,</w:t>
+            </w:r>
+            <w:r>
+              <w:t xml:space="preserve"> </w:t>
+            </w:r>
+            <w:r>
+              <w:rPr>
+                <w:rStyle w:val="VerbatimChar"/>
+              </w:rPr>
+              <w:t xml:space="preserve">GetByWorkerID</w:t>
+            </w:r>
+            <w:r>
+              <w:t xml:space="preserve">. Drives the stuck-task reaper + worker-crash recovery loop. Currently both return</w:t>
+            </w:r>
+            <w:r>
+              <w:t xml:space="preserve"> </w:t>
+            </w:r>
+            <w:r>
+              <w:rPr>
+                <w:rStyle w:val="VerbatimChar"/>
+              </w:rPr>
+              <w:t xml:space="preserve">ErrUnsupported (HRD-088)</w:t>
+            </w:r>
+            <w:r>
+              <w:t xml:space="preserve">. Scope: stale-threshold filter against</w:t>
+            </w:r>
+            <w:r>
+              <w:t xml:space="preserve"> </w:t>
+            </w:r>
+            <w:r>
+              <w:rPr>
+                <w:rStyle w:val="VerbatimChar"/>
+              </w:rPr>
+              <w:t xml:space="preserve">updated_at</w:t>
+            </w:r>
+            <w:r>
+              <w:t xml:space="preserve">; per-worker assignment lookup for re-dispatch after a worker disappears.</w:t>
+            </w:r>
+          </w:p>
+        </w:tc>
+        <w:tc>
+          <w:tcPr/>
+          <w:p>
+            <w:pPr>
+              <w:pStyle w:val="Compact"/>
+            </w:pPr>
+            <w:r>
+              <w:t xml:space="preserve">2026-05-20</w:t>
+            </w:r>
+          </w:p>
+        </w:tc>
+        <w:tc>
+          <w:tcPr/>
+          <w:p>
+            <w:pPr>
+              <w:pStyle w:val="Compact"/>
+            </w:pPr>
+            <w:r>
+              <w:t xml:space="preserve">2026-05-20</w:t>
+            </w:r>
+          </w:p>
+        </w:tc>
+        <w:tc>
+          <w:tcPr/>
+          <w:p>
+            <w:pPr>
+              <w:pStyle w:val="Compact"/>
+            </w:pPr>
+            <w:r>
+              <w:t xml:space="preserve">spec V3 §44 + upstream interface</w:t>
+            </w:r>
+            <w:r>
+              <w:t xml:space="preserve"> </w:t>
+            </w:r>
+            <w:r>
+              <w:rPr>
+                <w:rStyle w:val="VerbatimChar"/>
+              </w:rPr>
+              <w:t xml:space="preserve">TaskRepository</w:t>
+            </w:r>
+            <w:r>
+              <w:t xml:space="preserve"> </w:t>
+            </w:r>
+            <w:r>
+              <w:t xml:space="preserve">in</w:t>
+            </w:r>
+            <w:r>
+              <w:t xml:space="preserve"> </w:t>
+            </w:r>
+            <w:r>
+              <w:rPr>
+                <w:rStyle w:val="VerbatimChar"/>
+              </w:rPr>
+              <w:t xml:space="preserve">submodules/background/interfaces.go</w:t>
+            </w:r>
+            <w:r>
+              <w:t xml:space="preserve">; Catalogue-Check: extend</w:t>
+            </w:r>
+            <w:r>
+              <w:t xml:space="preserve"> </w:t>
+            </w:r>
+            <w:r>
+              <w:rPr>
+                <w:rStyle w:val="VerbatimChar"/>
+              </w:rPr>
+              <w:t xml:space="preserve">digital.vasic.background.TaskRepository@2d46dd60b2ffcb9d3b584b029b711a6fbc71b296</w:t>
+            </w:r>
+            <w:r>
+              <w:t xml:space="preserve"> </w:t>
+            </w:r>
+            <w:r>
+              <w:t xml:space="preserve">(recovery-loop surface — required before any worker is allowed to crash without operator intervention).</w:t>
+            </w:r>
+          </w:p>
+        </w:tc>
+      </w:tr>
+      <w:tr>
+        <w:tc>
+          <w:tcPr/>
+          <w:p>
+            <w:pPr>
+              <w:pStyle w:val="Compact"/>
+            </w:pPr>
+            <w:r>
+              <w:t xml:space="preserve">HRD-089</w:t>
+            </w:r>
+          </w:p>
+        </w:tc>
+        <w:tc>
+          <w:tcPr/>
+          <w:p>
+            <w:pPr>
+              <w:pStyle w:val="Compact"/>
+            </w:pPr>
+            <w:r>
+              <w:t xml:space="preserve">task</w:t>
+            </w:r>
+          </w:p>
+        </w:tc>
+        <w:tc>
+          <w:tcPr/>
+          <w:p>
+            <w:pPr>
+              <w:pStyle w:val="Compact"/>
+            </w:pPr>
+            <w:r>
+              <w:t xml:space="preserve">open</w:t>
+            </w:r>
+          </w:p>
+        </w:tc>
+        <w:tc>
+          <w:tcPr/>
+          <w:p>
+            <w:pPr>
+              <w:pStyle w:val="Compact"/>
+            </w:pPr>
+            <w:r>
+              <w:t xml:space="preserve">low</w:t>
+            </w:r>
+          </w:p>
+        </w:tc>
+        <w:tc>
+          <w:tcPr/>
+          <w:p>
+            <w:pPr>
+              <w:pStyle w:val="Compact"/>
+            </w:pPr>
+            <w:r>
+              <w:t xml:space="preserve">Implement resource-monitor I/O on</w:t>
+            </w:r>
+            <w:r>
+              <w:t xml:space="preserve"> </w:t>
+            </w:r>
+            <w:r>
+              <w:rPr>
+                <w:rStyle w:val="VerbatimChar"/>
+              </w:rPr>
+              <w:t xml:space="preserve">commons_infra.pgxTaskRepository</w:t>
+            </w:r>
+            <w:r>
+              <w:t xml:space="preserve"> </w:t>
+            </w:r>
+            <w:r>
+              <w:t xml:space="preserve">—</w:t>
+            </w:r>
+            <w:r>
+              <w:t xml:space="preserve"> </w:t>
+            </w:r>
+            <w:r>
+              <w:rPr>
+                <w:rStyle w:val="VerbatimChar"/>
+              </w:rPr>
+              <w:t xml:space="preserve">SaveResourceSnapshot</w:t>
+            </w:r>
+            <w:r>
+              <w:t xml:space="preserve">,</w:t>
+            </w:r>
+            <w:r>
+              <w:t xml:space="preserve"> </w:t>
+            </w:r>
+            <w:r>
+              <w:rPr>
+                <w:rStyle w:val="VerbatimChar"/>
+              </w:rPr>
+              <w:t xml:space="preserve">GetResourceSnapshots</w:t>
+            </w:r>
+            <w:r>
+              <w:t xml:space="preserve">. Persists per-task CPU/memory/IO samples for capacity-planning + post-mortem. Currently both return</w:t>
+            </w:r>
+            <w:r>
+              <w:t xml:space="preserve"> </w:t>
+            </w:r>
+            <w:r>
+              <w:rPr>
+                <w:rStyle w:val="VerbatimChar"/>
+              </w:rPr>
+              <w:t xml:space="preserve">ErrUnsupported (HRD-089)</w:t>
+            </w:r>
+            <w:r>
+              <w:t xml:space="preserve">. Scope: append-only insert keyed by</w:t>
+            </w:r>
+            <w:r>
+              <w:t xml:space="preserve"> </w:t>
+            </w:r>
+            <w:r>
+              <w:rPr>
+                <w:rStyle w:val="VerbatimChar"/>
+              </w:rPr>
+              <w:t xml:space="preserve">(task_id, captured_at)</w:t>
+            </w:r>
+            <w:r>
+              <w:t xml:space="preserve">; per-task paginated read in reverse-chronological order. Schema target: a</w:t>
+            </w:r>
+            <w:r>
+              <w:t xml:space="preserve"> </w:t>
+            </w:r>
+            <w:r>
+              <w:rPr>
+                <w:rStyle w:val="VerbatimChar"/>
+              </w:rPr>
+              <w:t xml:space="preserve">task_resource_snapshots</w:t>
+            </w:r>
+            <w:r>
+              <w:t xml:space="preserve"> </w:t>
+            </w:r>
+            <w:r>
+              <w:t xml:space="preserve">table not yet in the §9.6 migration set — adding it is part of this HRD.</w:t>
+            </w:r>
+          </w:p>
+        </w:tc>
+        <w:tc>
+          <w:tcPr/>
+          <w:p>
+            <w:pPr>
+              <w:pStyle w:val="Compact"/>
+            </w:pPr>
+            <w:r>
+              <w:t xml:space="preserve">2026-05-20</w:t>
+            </w:r>
+          </w:p>
+        </w:tc>
+        <w:tc>
+          <w:tcPr/>
+          <w:p>
+            <w:pPr>
+              <w:pStyle w:val="Compact"/>
+            </w:pPr>
+            <w:r>
+              <w:t xml:space="preserve">2026-05-20</w:t>
+            </w:r>
+          </w:p>
+        </w:tc>
+        <w:tc>
+          <w:tcPr/>
+          <w:p>
+            <w:pPr>
+              <w:pStyle w:val="Compact"/>
+            </w:pPr>
+            <w:r>
+              <w:t xml:space="preserve">spec V3 §44 + upstream interface</w:t>
+            </w:r>
+            <w:r>
+              <w:t xml:space="preserve"> </w:t>
+            </w:r>
+            <w:r>
+              <w:rPr>
+                <w:rStyle w:val="VerbatimChar"/>
+              </w:rPr>
+              <w:t xml:space="preserve">TaskRepository</w:t>
+            </w:r>
+            <w:r>
+              <w:t xml:space="preserve"> </w:t>
+            </w:r>
+            <w:r>
+              <w:t xml:space="preserve">in</w:t>
+            </w:r>
+            <w:r>
+              <w:t xml:space="preserve"> </w:t>
+            </w:r>
+            <w:r>
+              <w:rPr>
+                <w:rStyle w:val="VerbatimChar"/>
+              </w:rPr>
+              <w:t xml:space="preserve">submodules/background/interfaces.go</w:t>
+            </w:r>
+            <w:r>
+              <w:t xml:space="preserve">; Catalogue-Check: extend</w:t>
+            </w:r>
+            <w:r>
+              <w:t xml:space="preserve"> </w:t>
+            </w:r>
+            <w:r>
+              <w:rPr>
+                <w:rStyle w:val="VerbatimChar"/>
+              </w:rPr>
+              <w:t xml:space="preserve">digital.vasic.background.TaskRepository@2d46dd60b2ffcb9d3b584b029b711a6fbc71b296</w:t>
+            </w:r>
+            <w:r>
+              <w:t xml:space="preserve"> </w:t>
+            </w:r>
+            <w:r>
+              <w:t xml:space="preserve">(resource telemetry — composes with</w:t>
+            </w:r>
+            <w:r>
+              <w:t xml:space="preserve"> </w:t>
+            </w:r>
+            <w:r>
+              <w:rPr>
+                <w:rStyle w:val="VerbatimChar"/>
+              </w:rPr>
+              <w:t xml:space="preserve">digital.vasic.observability</w:t>
+            </w:r>
+            <w:r>
+              <w:t xml:space="preserve"> </w:t>
+            </w:r>
+            <w:r>
+              <w:t xml:space="preserve">OTel pipeline but is durable, not stream-only).</w:t>
+            </w:r>
+          </w:p>
+        </w:tc>
+      </w:tr>
+      <w:tr>
+        <w:tc>
+          <w:tcPr/>
+          <w:p>
+            <w:pPr>
+              <w:pStyle w:val="Compact"/>
+            </w:pPr>
+            <w:r>
+              <w:t xml:space="preserve">HRD-090</w:t>
+            </w:r>
+          </w:p>
+        </w:tc>
+        <w:tc>
+          <w:tcPr/>
+          <w:p>
+            <w:pPr>
+              <w:pStyle w:val="Compact"/>
+            </w:pPr>
+            <w:r>
+              <w:t xml:space="preserve">task</w:t>
+            </w:r>
+          </w:p>
+        </w:tc>
+        <w:tc>
+          <w:tcPr/>
+          <w:p>
+            <w:pPr>
+              <w:pStyle w:val="Compact"/>
+            </w:pPr>
+            <w:r>
+              <w:t xml:space="preserve">open</w:t>
+            </w:r>
+          </w:p>
+        </w:tc>
+        <w:tc>
+          <w:tcPr/>
+          <w:p>
+            <w:pPr>
+              <w:pStyle w:val="Compact"/>
+            </w:pPr>
+            <w:r>
+              <w:t xml:space="preserve">middle</w:t>
+            </w:r>
+          </w:p>
+        </w:tc>
+        <w:tc>
+          <w:tcPr/>
+          <w:p>
+            <w:pPr>
+              <w:pStyle w:val="Compact"/>
+            </w:pPr>
+            <w:r>
+              <w:t xml:space="preserve">Implement dead-letter handling on</w:t>
+            </w:r>
+            <w:r>
+              <w:t xml:space="preserve"> </w:t>
+            </w:r>
+            <w:r>
+              <w:rPr>
+                <w:rStyle w:val="VerbatimChar"/>
+              </w:rPr>
+              <w:t xml:space="preserve">commons_infra.pgxTaskRepository</w:t>
+            </w:r>
+            <w:r>
+              <w:t xml:space="preserve"> </w:t>
+            </w:r>
+            <w:r>
+              <w:t xml:space="preserve">—</w:t>
+            </w:r>
+            <w:r>
+              <w:t xml:space="preserve"> </w:t>
+            </w:r>
+            <w:r>
+              <w:rPr>
+                <w:rStyle w:val="VerbatimChar"/>
+              </w:rPr>
+              <w:t xml:space="preserve">MoveToDeadLetter</w:t>
+            </w:r>
+            <w:r>
+              <w:t xml:space="preserve">. Required failure path when a task exhausts retries or fails a §107 invariant. Currently returns</w:t>
+            </w:r>
+            <w:r>
+              <w:t xml:space="preserve"> </w:t>
+            </w:r>
+            <w:r>
+              <w:rPr>
+                <w:rStyle w:val="VerbatimChar"/>
+              </w:rPr>
+              <w:t xml:space="preserve">ErrUnsupported (HRD-090)</w:t>
+            </w:r>
+            <w:r>
+              <w:t xml:space="preserve">. Scope: atomically move the BackgroundTask row to a</w:t>
+            </w:r>
+            <w:r>
+              <w:t xml:space="preserve"> </w:t>
+            </w:r>
+            <w:r>
+              <w:rPr>
+                <w:rStyle w:val="VerbatimChar"/>
+              </w:rPr>
+              <w:t xml:space="preserve">dead_letter_tasks</w:t>
+            </w:r>
+            <w:r>
+              <w:t xml:space="preserve"> </w:t>
+            </w:r>
+            <w:r>
+              <w:t xml:space="preserve">table with the failure-reason string + original-row JSONB snapshot; emit a</w:t>
+            </w:r>
+            <w:r>
+              <w:t xml:space="preserve"> </w:t>
+            </w:r>
+            <w:r>
+              <w:rPr>
+                <w:rStyle w:val="VerbatimChar"/>
+              </w:rPr>
+              <w:t xml:space="preserve">.queue.dead_letter</w:t>
+            </w:r>
+            <w:r>
+              <w:t xml:space="preserve"> </w:t>
+            </w:r>
+            <w:r>
+              <w:t xml:space="preserve">event via</w:t>
+            </w:r>
+            <w:r>
+              <w:t xml:space="preserve"> </w:t>
+            </w:r>
+            <w:r>
+              <w:rPr>
+                <w:rStyle w:val="VerbatimChar"/>
+              </w:rPr>
+              <w:t xml:space="preserve">commons_constitution</w:t>
+            </w:r>
+            <w:r>
+              <w:t xml:space="preserve"> </w:t>
+            </w:r>
+            <w:r>
+              <w:t xml:space="preserve">per §42.1. Schema target: a</w:t>
+            </w:r>
+            <w:r>
+              <w:t xml:space="preserve"> </w:t>
+            </w:r>
+            <w:r>
+              <w:rPr>
+                <w:rStyle w:val="VerbatimChar"/>
+              </w:rPr>
+              <w:t xml:space="preserve">dead_letter_tasks</w:t>
+            </w:r>
+            <w:r>
+              <w:t xml:space="preserve"> </w:t>
+            </w:r>
+            <w:r>
+              <w:t xml:space="preserve">table not yet in the §9.6 migration set — adding it is part of this HRD.</w:t>
+            </w:r>
+          </w:p>
+        </w:tc>
+        <w:tc>
+          <w:tcPr/>
+          <w:p>
+            <w:pPr>
+              <w:pStyle w:val="Compact"/>
+            </w:pPr>
+            <w:r>
+              <w:t xml:space="preserve">2026-05-20</w:t>
+            </w:r>
+          </w:p>
+        </w:tc>
+        <w:tc>
+          <w:tcPr/>
+          <w:p>
+            <w:pPr>
+              <w:pStyle w:val="Compact"/>
+            </w:pPr>
+            <w:r>
+              <w:t xml:space="preserve">2026-05-20</w:t>
+            </w:r>
+          </w:p>
+        </w:tc>
+        <w:tc>
+          <w:tcPr/>
+          <w:p>
+            <w:pPr>
+              <w:pStyle w:val="Compact"/>
+            </w:pPr>
+            <w:r>
+              <w:t xml:space="preserve">spec V3 §44 + upstream interface</w:t>
+            </w:r>
+            <w:r>
+              <w:t xml:space="preserve"> </w:t>
+            </w:r>
+            <w:r>
+              <w:rPr>
+                <w:rStyle w:val="VerbatimChar"/>
+              </w:rPr>
+              <w:t xml:space="preserve">TaskRepository</w:t>
+            </w:r>
+            <w:r>
+              <w:t xml:space="preserve"> </w:t>
+            </w:r>
+            <w:r>
+              <w:t xml:space="preserve">in</w:t>
+            </w:r>
+            <w:r>
+              <w:t xml:space="preserve"> </w:t>
+            </w:r>
+            <w:r>
+              <w:rPr>
+                <w:rStyle w:val="VerbatimChar"/>
+              </w:rPr>
+              <w:t xml:space="preserve">submodules/background/interfaces.go</w:t>
+            </w:r>
+            <w:r>
+              <w:t xml:space="preserve">; Catalogue-Check: extend</w:t>
+            </w:r>
+            <w:r>
+              <w:t xml:space="preserve"> </w:t>
+            </w:r>
+            <w:r>
+              <w:rPr>
+                <w:rStyle w:val="VerbatimChar"/>
+              </w:rPr>
+              <w:t xml:space="preserve">digital.vasic.background.TaskRepository@2d46dd60b2ffcb9d3b584b029b711a6fbc71b296</w:t>
+            </w:r>
+            <w:r>
+              <w:t xml:space="preserve"> </w:t>
+            </w:r>
+            <w:r>
+              <w:t xml:space="preserve">(failure-terminal surface — composes with HRD-085 GetByID + HRD-018 cherald event emission).</w:t>
             </w:r>
           </w:p>
         </w:tc>
@@ -5544,7 +6949,8 @@
     <w:tbl>
       <w:tblPr>
         <w:tblStyle w:val="Table"/>
-        <w:tblW w:type="auto" w:w="0"/>
+        <w:tblW w:type="pct" w:w="5000"/>
+        <w:tblLayout w:type="fixed"/>
         <w:tblLook w:firstRow="1" w:lastRow="0" w:firstColumn="0" w:lastColumn="0" w:noHBand="0" w:noVBand="0" w:val="0020"/>
       </w:tblPr>
       <w:tblGrid>

</xml_diff>

<commit_message>
test(v1.0.0 Batch C C1): wire e2e E97-E100 + mark 6 pherald §43 rows in_progress
Finalizes Batch C cluster C1 (pherald §43 gitops command catalogue,
landed in 502ebf6). Flips HRD-029/030/043/044/049/053 Open→in_progress
in docs/Issues.md (r17→r18) with evidence-dir pointers, and wires four
anti-bluff e2e invariants into scripts/e2e_bluff_hunt.sh:

  E97  §2        commit-push      → TestCommitPush_CommitsAndPushesToFakeRemote
  E98  §11.4.55  reopen           → TestReopen_MigratesRowAndWritesReopensRecord
  E99  §11.4.36  install-upstreams→ TestInstallUpstreams_ApplyConfiguresRemotes
  E100 §11.4.37  fetch-guard      → TestFetchGuard_Rebased_PASS

Each check runs the hermetic temp-repo + file:// fake-remote go test
under -race, paired with sc_anchor against its committed
docs/qa/HRD-NNN-20260527T213201Z/transcript.txt (test names + anchor
strings verified present, grep -c=1). The 4 tests pass -race locally.

Co-Authored-By: Claude Opus 4.7 <noreply@anthropic.com>
</commit_message>
<xml_diff>
--- a/docs/Issues.docx
+++ b/docs/Issues.docx
@@ -75,7 +75,7 @@
               <w:pStyle w:val="Compact"/>
             </w:pPr>
             <w:r>
-              <w:t xml:space="preserve">17</w:t>
+              <w:t xml:space="preserve">18</w:t>
             </w:r>
           </w:p>
         </w:tc>
@@ -123,7 +123,7 @@
               <w:pStyle w:val="Compact"/>
             </w:pPr>
             <w:r>
-              <w:t xml:space="preserve">2026-05-27</w:t>
+              <w:t xml:space="preserve">2026-05-28</w:t>
             </w:r>
           </w:p>
         </w:tc>
@@ -175,7 +175,252 @@
                 <w:b/>
                 <w:bCs/>
               </w:rPr>
-              <w:t xml:space="preserve">r17 (v1.0.0 Batch A) atomically migrates HRD-018 + HRD-026 + HRD-027 Issues→Fixed per §11.4.19.</w:t>
+              <w:t xml:space="preserve">r18 (v1.0.0 Batch C cluster C1) marks HRD-029/030/043/044/049/053 (pherald §43 gitops command catalogue) Open→in_progress.</w:t>
+            </w:r>
+            <w:r>
+              <w:t xml:space="preserve"> </w:t>
+            </w:r>
+            <w:r>
+              <w:t xml:space="preserve">The six commands landed (commit</w:t>
+            </w:r>
+            <w:r>
+              <w:t xml:space="preserve"> </w:t>
+            </w:r>
+            <w:r>
+              <w:rPr>
+                <w:rStyle w:val="VerbatimChar"/>
+              </w:rPr>
+              <w:t xml:space="preserve">502ebf6</w:t>
+            </w:r>
+            <w:r>
+              <w:t xml:space="preserve">) as</w:t>
+            </w:r>
+            <w:r>
+              <w:t xml:space="preserve"> </w:t>
+            </w:r>
+            <w:r>
+              <w:rPr>
+                <w:rStyle w:val="VerbatimChar"/>
+              </w:rPr>
+              <w:t xml:space="preserve">pherald/internal/gitops/{gitops.go,upstreams.go}</w:t>
+            </w:r>
+            <w:r>
+              <w:t xml:space="preserve"> </w:t>
+            </w:r>
+            <w:r>
+              <w:t xml:space="preserve">+</w:t>
+            </w:r>
+            <w:r>
+              <w:t xml:space="preserve"> </w:t>
+            </w:r>
+            <w:r>
+              <w:rPr>
+                <w:rStyle w:val="VerbatimChar"/>
+              </w:rPr>
+              <w:t xml:space="preserve">pherald/cmd/pherald/gitops_cmds.go</w:t>
+            </w:r>
+            <w:r>
+              <w:t xml:space="preserve">:</w:t>
+            </w:r>
+            <w:r>
+              <w:t xml:space="preserve"> </w:t>
+            </w:r>
+            <w:r>
+              <w:rPr>
+                <w:rStyle w:val="VerbatimChar"/>
+              </w:rPr>
+              <w:t xml:space="preserve">commit-push</w:t>
+            </w:r>
+            <w:r>
+              <w:t xml:space="preserve"> </w:t>
+            </w:r>
+            <w:r>
+              <w:t xml:space="preserve">(single locked entrypoint + multi-mirror push),</w:t>
+            </w:r>
+            <w:r>
+              <w:t xml:space="preserve"> </w:t>
+            </w:r>
+            <w:r>
+              <w:rPr>
+                <w:rStyle w:val="VerbatimChar"/>
+              </w:rPr>
+              <w:t xml:space="preserve">submodule propagate</w:t>
+            </w:r>
+            <w:r>
+              <w:t xml:space="preserve"> </w:t>
+            </w:r>
+            <w:r>
+              <w:t xml:space="preserve">(owned-submodule walk in propagation order),</w:t>
+            </w:r>
+            <w:r>
+              <w:t xml:space="preserve"> </w:t>
+            </w:r>
+            <w:r>
+              <w:rPr>
+                <w:rStyle w:val="VerbatimChar"/>
+              </w:rPr>
+              <w:t xml:space="preserve">install-upstreams</w:t>
+            </w:r>
+            <w:r>
+              <w:t xml:space="preserve"> </w:t>
+            </w:r>
+            <w:r>
+              <w:t xml:space="preserve">(§11.4.74</w:t>
+            </w:r>
+            <w:r>
+              <w:t xml:space="preserve"> </w:t>
+            </w:r>
+            <w:r>
+              <w:rPr>
+                <w:rStyle w:val="VerbatimChar"/>
+              </w:rPr>
+              <w:t xml:space="preserve">FindScript</w:t>
+            </w:r>
+            <w:r>
+              <w:t xml:space="preserve">-resolved constitution-submodule script, git-binary fallback),</w:t>
+            </w:r>
+            <w:r>
+              <w:t xml:space="preserve"> </w:t>
+            </w:r>
+            <w:r>
+              <w:rPr>
+                <w:rStyle w:val="VerbatimChar"/>
+              </w:rPr>
+              <w:t xml:space="preserve">fetch-guard</w:t>
+            </w:r>
+            <w:r>
+              <w:t xml:space="preserve"> </w:t>
+            </w:r>
+            <w:r>
+              <w:t xml:space="preserve">(§11.4.37 pre-edit fetch + rebase enforcement),</w:t>
+            </w:r>
+            <w:r>
+              <w:t xml:space="preserve"> </w:t>
+            </w:r>
+            <w:r>
+              <w:rPr>
+                <w:rStyle w:val="VerbatimChar"/>
+              </w:rPr>
+              <w:t xml:space="preserve">reopen</w:t>
+            </w:r>
+            <w:r>
+              <w:t xml:space="preserve"> </w:t>
+            </w:r>
+            <w:r>
+              <w:t xml:space="preserve">(§11.4.55 Fixed→Issues reversal +</w:t>
+            </w:r>
+            <w:r>
+              <w:t xml:space="preserve"> </w:t>
+            </w:r>
+            <w:r>
+              <w:rPr>
+                <w:rStyle w:val="VerbatimChar"/>
+              </w:rPr>
+              <w:t xml:space="preserve">docs/Reopens/</w:t>
+            </w:r>
+            <w:r>
+              <w:t xml:space="preserve"> </w:t>
+            </w:r>
+            <w:r>
+              <w:t xml:space="preserve">history, reusing the Wave 6.5 inbound migration),</w:t>
+            </w:r>
+            <w:r>
+              <w:t xml:space="preserve"> </w:t>
+            </w:r>
+            <w:r>
+              <w:rPr>
+                <w:rStyle w:val="VerbatimChar"/>
+              </w:rPr>
+              <w:t xml:space="preserve">pre-push</w:t>
+            </w:r>
+            <w:r>
+              <w:t xml:space="preserve"> </w:t>
+            </w:r>
+            <w:r>
+              <w:t xml:space="preserve">(§11.4.71 fetch + investigate + integrate hook) — each</w:t>
+            </w:r>
+            <w:r>
+              <w:t xml:space="preserve"> </w:t>
+            </w:r>
+            <w:r>
+              <w:rPr>
+                <w:rStyle w:val="VerbatimChar"/>
+              </w:rPr>
+              <w:t xml:space="preserve">--emit</w:t>
+            </w:r>
+            <w:r>
+              <w:t xml:space="preserve"> </w:t>
+            </w:r>
+            <w:r>
+              <w:t xml:space="preserve">feeds the HRD-023 pherald binding, all hermetic temp-repo +</w:t>
+            </w:r>
+            <w:r>
+              <w:t xml:space="preserve"> </w:t>
+            </w:r>
+            <w:r>
+              <w:rPr>
+                <w:rStyle w:val="VerbatimChar"/>
+              </w:rPr>
+              <w:t xml:space="preserve">file://</w:t>
+            </w:r>
+            <w:r>
+              <w:t xml:space="preserve"> </w:t>
+            </w:r>
+            <w:r>
+              <w:t xml:space="preserve">fake-remote tested</w:t>
+            </w:r>
+            <w:r>
+              <w:t xml:space="preserve"> </w:t>
+            </w:r>
+            <w:r>
+              <w:rPr>
+                <w:rStyle w:val="VerbatimChar"/>
+              </w:rPr>
+              <w:t xml:space="preserve">-race -count=3</w:t>
+            </w:r>
+            <w:r>
+              <w:t xml:space="preserve"> </w:t>
+            </w:r>
+            <w:r>
+              <w:t xml:space="preserve">green. e2e invariants</w:t>
+            </w:r>
+            <w:r>
+              <w:t xml:space="preserve"> </w:t>
+            </w:r>
+            <w:r>
+              <w:rPr>
+                <w:b/>
+                <w:bCs/>
+              </w:rPr>
+              <w:t xml:space="preserve">E97-E100</w:t>
+            </w:r>
+            <w:r>
+              <w:t xml:space="preserve"> </w:t>
+            </w:r>
+            <w:r>
+              <w:t xml:space="preserve">wired (commit-push / reopen / install-upstreams / fetch-guard), each anchored to its</w:t>
+            </w:r>
+            <w:r>
+              <w:t xml:space="preserve"> </w:t>
+            </w:r>
+            <w:r>
+              <w:rPr>
+                <w:rStyle w:val="VerbatimChar"/>
+              </w:rPr>
+              <w:t xml:space="preserve">docs/qa/HRD-NNN-20260527T213201Z/transcript.txt</w:t>
+            </w:r>
+            <w:r>
+              <w:t xml:space="preserve">.</w:t>
+            </w:r>
+            <w:r>
+              <w:t xml:space="preserve"> </w:t>
+            </w:r>
+            <w:r>
+              <w:rPr>
+                <w:b/>
+                <w:bCs/>
+              </w:rPr>
+              <w:t xml:space="preserve">Prior r17 (v1.0.0 Batch A) atomically migrated HRD-018 + HRD-026 + HRD-027 Issues→Fixed per §11.4.19.</w:t>
             </w:r>
             <w:r>
               <w:t xml:space="preserve"> </w:t>
@@ -3177,7 +3422,7 @@
               <w:pStyle w:val="Compact"/>
             </w:pPr>
             <w:r>
-              <w:t xml:space="preserve">open</w:t>
+              <w:t xml:space="preserve">in_progress</w:t>
             </w:r>
           </w:p>
         </w:tc>
@@ -3214,7 +3459,7 @@
               <w:t xml:space="preserve"> </w:t>
             </w:r>
             <w:r>
-              <w:t xml:space="preserve">— single-entrypoint locked commit + multi-mirror push</w:t>
+              <w:t xml:space="preserve">— single-entrypoint locked commit + multi-mirror push — Batch C: implemented as gitops command (§11.4.74 wrap of git binary); --emit feeds HRD-023 binding; hermetic temp-repo tests -race green</w:t>
             </w:r>
           </w:p>
         </w:tc>
@@ -3236,18 +3481,27 @@
               <w:pStyle w:val="Compact"/>
             </w:pPr>
             <w:r>
-              <w:t xml:space="preserve">2026-05-20</w:t>
-            </w:r>
-          </w:p>
-        </w:tc>
-        <w:tc>
-          <w:tcPr/>
-          <w:p>
-            <w:pPr>
-              <w:pStyle w:val="Compact"/>
-            </w:pPr>
-            <w:r>
-              <w:t xml:space="preserve">spec §43.2 / §2; Catalogue-Check: TBD (likely existing as constitution-submodule script)</w:t>
+              <w:t xml:space="preserve">2026-05-28</w:t>
+            </w:r>
+          </w:p>
+        </w:tc>
+        <w:tc>
+          <w:tcPr/>
+          <w:p>
+            <w:pPr>
+              <w:pStyle w:val="Compact"/>
+            </w:pPr>
+            <w:r>
+              <w:t xml:space="preserve">spec §43.2 / §2; Catalogue-Check: TBD (likely existing as constitution-submodule script); evidence</w:t>
+            </w:r>
+            <w:r>
+              <w:t xml:space="preserve"> </w:t>
+            </w:r>
+            <w:r>
+              <w:rPr>
+                <w:rStyle w:val="VerbatimChar"/>
+              </w:rPr>
+              <w:t xml:space="preserve">docs/qa/HRD-029-20260527T213201Z/</w:t>
             </w:r>
           </w:p>
         </w:tc>
@@ -3282,7 +3536,7 @@
               <w:pStyle w:val="Compact"/>
             </w:pPr>
             <w:r>
-              <w:t xml:space="preserve">open</w:t>
+              <w:t xml:space="preserve">in_progress</w:t>
             </w:r>
           </w:p>
         </w:tc>
@@ -3319,7 +3573,7 @@
               <w:t xml:space="preserve"> </w:t>
             </w:r>
             <w:r>
-              <w:t xml:space="preserve">— owned-submodule walk in propagation order</w:t>
+              <w:t xml:space="preserve">— owned-submodule walk in propagation order — Batch C: implemented as gitops command (§11.4.74 wrap of git binary); --emit feeds HRD-023 binding; hermetic temp-repo tests -race green</w:t>
             </w:r>
           </w:p>
         </w:tc>
@@ -3341,18 +3595,27 @@
               <w:pStyle w:val="Compact"/>
             </w:pPr>
             <w:r>
-              <w:t xml:space="preserve">2026-05-20</w:t>
-            </w:r>
-          </w:p>
-        </w:tc>
-        <w:tc>
-          <w:tcPr/>
-          <w:p>
-            <w:pPr>
-              <w:pStyle w:val="Compact"/>
-            </w:pPr>
-            <w:r>
-              <w:t xml:space="preserve">spec §43.2 / §3; Catalogue-Check: TBD</w:t>
+              <w:t xml:space="preserve">2026-05-28</w:t>
+            </w:r>
+          </w:p>
+        </w:tc>
+        <w:tc>
+          <w:tcPr/>
+          <w:p>
+            <w:pPr>
+              <w:pStyle w:val="Compact"/>
+            </w:pPr>
+            <w:r>
+              <w:t xml:space="preserve">spec §43.2 / §3; Catalogue-Check: TBD; evidence</w:t>
+            </w:r>
+            <w:r>
+              <w:t xml:space="preserve"> </w:t>
+            </w:r>
+            <w:r>
+              <w:rPr>
+                <w:rStyle w:val="VerbatimChar"/>
+              </w:rPr>
+              <w:t xml:space="preserve">docs/qa/HRD-030-20260527T213201Z/</w:t>
             </w:r>
           </w:p>
         </w:tc>
@@ -4695,7 +4958,7 @@
               <w:pStyle w:val="Compact"/>
             </w:pPr>
             <w:r>
-              <w:t xml:space="preserve">open</w:t>
+              <w:t xml:space="preserve">in_progress</w:t>
             </w:r>
           </w:p>
         </w:tc>
@@ -4732,7 +4995,7 @@
               <w:t xml:space="preserve"> </w:t>
             </w:r>
             <w:r>
-              <w:t xml:space="preserve">— install_upstreams wrapper</w:t>
+              <w:t xml:space="preserve">— install_upstreams wrapper — Batch C: implemented as gitops command (§11.4.74 FindScript-resolved constitution script); --emit feeds HRD-023 binding; hermetic temp-repo tests -race green</w:t>
             </w:r>
           </w:p>
         </w:tc>
@@ -4754,18 +5017,27 @@
               <w:pStyle w:val="Compact"/>
             </w:pPr>
             <w:r>
-              <w:t xml:space="preserve">2026-05-20</w:t>
-            </w:r>
-          </w:p>
-        </w:tc>
-        <w:tc>
-          <w:tcPr/>
-          <w:p>
-            <w:pPr>
-              <w:pStyle w:val="Compact"/>
-            </w:pPr>
-            <w:r>
-              <w:t xml:space="preserve">spec §43.2 / §11.4.36; Catalogue-Check: extend constitution submodule's install_upstreams.sh</w:t>
+              <w:t xml:space="preserve">2026-05-28</w:t>
+            </w:r>
+          </w:p>
+        </w:tc>
+        <w:tc>
+          <w:tcPr/>
+          <w:p>
+            <w:pPr>
+              <w:pStyle w:val="Compact"/>
+            </w:pPr>
+            <w:r>
+              <w:t xml:space="preserve">spec §43.2 / §11.4.36; Catalogue-Check: extend constitution submodule's install_upstreams.sh; evidence</w:t>
+            </w:r>
+            <w:r>
+              <w:t xml:space="preserve"> </w:t>
+            </w:r>
+            <w:r>
+              <w:rPr>
+                <w:rStyle w:val="VerbatimChar"/>
+              </w:rPr>
+              <w:t xml:space="preserve">docs/qa/HRD-043-20260527T213201Z/</w:t>
             </w:r>
           </w:p>
         </w:tc>
@@ -4800,7 +5072,7 @@
               <w:pStyle w:val="Compact"/>
             </w:pPr>
             <w:r>
-              <w:t xml:space="preserve">open</w:t>
+              <w:t xml:space="preserve">in_progress</w:t>
             </w:r>
           </w:p>
         </w:tc>
@@ -4837,7 +5109,7 @@
               <w:t xml:space="preserve"> </w:t>
             </w:r>
             <w:r>
-              <w:t xml:space="preserve">— pre-edit fetch + rebase enforcement</w:t>
+              <w:t xml:space="preserve">— pre-edit fetch + rebase enforcement — Batch C: implemented as gitops command (§11.4.74 wrap of git binary); --emit feeds HRD-023 binding; hermetic temp-repo tests -race green</w:t>
             </w:r>
           </w:p>
         </w:tc>
@@ -4859,18 +5131,27 @@
               <w:pStyle w:val="Compact"/>
             </w:pPr>
             <w:r>
-              <w:t xml:space="preserve">2026-05-20</w:t>
-            </w:r>
-          </w:p>
-        </w:tc>
-        <w:tc>
-          <w:tcPr/>
-          <w:p>
-            <w:pPr>
-              <w:pStyle w:val="Compact"/>
-            </w:pPr>
-            <w:r>
-              <w:t xml:space="preserve">spec §43.2 / §11.4.37; Catalogue-Check: TBD</w:t>
+              <w:t xml:space="preserve">2026-05-28</w:t>
+            </w:r>
+          </w:p>
+        </w:tc>
+        <w:tc>
+          <w:tcPr/>
+          <w:p>
+            <w:pPr>
+              <w:pStyle w:val="Compact"/>
+            </w:pPr>
+            <w:r>
+              <w:t xml:space="preserve">spec §43.2 / §11.4.37; Catalogue-Check: TBD; evidence</w:t>
+            </w:r>
+            <w:r>
+              <w:t xml:space="preserve"> </w:t>
+            </w:r>
+            <w:r>
+              <w:rPr>
+                <w:rStyle w:val="VerbatimChar"/>
+              </w:rPr>
+              <w:t xml:space="preserve">docs/qa/HRD-044-20260527T213201Z/</w:t>
             </w:r>
           </w:p>
         </w:tc>
@@ -5325,7 +5606,7 @@
               <w:pStyle w:val="Compact"/>
             </w:pPr>
             <w:r>
-              <w:t xml:space="preserve">open</w:t>
+              <w:t xml:space="preserve">in_progress</w:t>
             </w:r>
           </w:p>
         </w:tc>
@@ -5362,7 +5643,7 @@
               <w:t xml:space="preserve"> </w:t>
             </w:r>
             <w:r>
-              <w:t xml:space="preserve">— Issues→Fixed reversal + Reopens history</w:t>
+              <w:t xml:space="preserve">— Issues→Fixed reversal + Reopens history — Batch C: implemented as gitops command (the Wave 6.5 inbound Fixed→Issues migration); --emit feeds HRD-023 binding; hermetic temp-repo tests -race green</w:t>
             </w:r>
           </w:p>
         </w:tc>
@@ -5384,18 +5665,27 @@
               <w:pStyle w:val="Compact"/>
             </w:pPr>
             <w:r>
-              <w:t xml:space="preserve">2026-05-20</w:t>
-            </w:r>
-          </w:p>
-        </w:tc>
-        <w:tc>
-          <w:tcPr/>
-          <w:p>
-            <w:pPr>
-              <w:pStyle w:val="Compact"/>
-            </w:pPr>
-            <w:r>
-              <w:t xml:space="preserve">spec §43.2 / §11.4.55; Catalogue-Check: no-match (Herald-specific HRD flow)</w:t>
+              <w:t xml:space="preserve">2026-05-28</w:t>
+            </w:r>
+          </w:p>
+        </w:tc>
+        <w:tc>
+          <w:tcPr/>
+          <w:p>
+            <w:pPr>
+              <w:pStyle w:val="Compact"/>
+            </w:pPr>
+            <w:r>
+              <w:t xml:space="preserve">spec §43.2 / §11.4.55; Catalogue-Check: no-match (Herald-specific HRD flow); evidence</w:t>
+            </w:r>
+            <w:r>
+              <w:t xml:space="preserve"> </w:t>
+            </w:r>
+            <w:r>
+              <w:rPr>
+                <w:rStyle w:val="VerbatimChar"/>
+              </w:rPr>
+              <w:t xml:space="preserve">docs/qa/HRD-049-20260527T213201Z/</w:t>
             </w:r>
           </w:p>
         </w:tc>
@@ -5745,7 +6035,7 @@
               <w:pStyle w:val="Compact"/>
             </w:pPr>
             <w:r>
-              <w:t xml:space="preserve">open</w:t>
+              <w:t xml:space="preserve">in_progress</w:t>
             </w:r>
           </w:p>
         </w:tc>
@@ -5782,7 +6072,7 @@
               <w:t xml:space="preserve"> </w:t>
             </w:r>
             <w:r>
-              <w:t xml:space="preserve">— fetch + investigate + integrate hook</w:t>
+              <w:t xml:space="preserve">— fetch + investigate + integrate hook — Batch C: implemented as gitops command (§11.4.74 wrap of git binary); --emit feeds HRD-023 binding; hermetic temp-repo tests -race green</w:t>
             </w:r>
           </w:p>
         </w:tc>
@@ -5804,18 +6094,27 @@
               <w:pStyle w:val="Compact"/>
             </w:pPr>
             <w:r>
-              <w:t xml:space="preserve">2026-05-20</w:t>
-            </w:r>
-          </w:p>
-        </w:tc>
-        <w:tc>
-          <w:tcPr/>
-          <w:p>
-            <w:pPr>
-              <w:pStyle w:val="Compact"/>
-            </w:pPr>
-            <w:r>
-              <w:t xml:space="preserve">spec §43.2 / §11.4.71; Catalogue-Check: TBD</w:t>
+              <w:t xml:space="preserve">2026-05-28</w:t>
+            </w:r>
+          </w:p>
+        </w:tc>
+        <w:tc>
+          <w:tcPr/>
+          <w:p>
+            <w:pPr>
+              <w:pStyle w:val="Compact"/>
+            </w:pPr>
+            <w:r>
+              <w:t xml:space="preserve">spec §43.2 / §11.4.71; Catalogue-Check: TBD; evidence</w:t>
+            </w:r>
+            <w:r>
+              <w:t xml:space="preserve"> </w:t>
+            </w:r>
+            <w:r>
+              <w:rPr>
+                <w:rStyle w:val="VerbatimChar"/>
+              </w:rPr>
+              <w:t xml:space="preserve">docs/qa/HRD-053-20260527T213201Z/</w:t>
             </w:r>
           </w:p>
         </w:tc>

</xml_diff>

<commit_message>
docs(§11.4.90): close HRD-015 Obsolete — Go-scaffold I8 invariant superseded by design change
HRD-015 asked for an 'I8 inheritance-gate invariant for the Go scaffold (go.work + commons/types.go + null adapter)'. The I8 gate slot was repurposed for the §107 end-user-usability covenant (I8a/b/c in tests/test_constitution_inheritance.sh), and the scaffold's correctness is now verified by the broader suite (null adapter is fully tested; go.work + types.go build green — 18/18 modules + gate 15/0 per the 2026-05-30 baseline). Closed Obsolete with §11.4.6 triple-check evidence; no code change. Issues r44→r45, Status r19→r20. Open set: HRD-015 moves to the Obsolete group (HRD-015/143/144/145).

Co-Authored-By: Claude Opus 4.8 <noreply@anthropic.com>
</commit_message>
<xml_diff>
--- a/docs/Issues.docx
+++ b/docs/Issues.docx
@@ -75,7 +75,7 @@
               <w:pStyle w:val="Compact"/>
             </w:pPr>
             <w:r>
-              <w:t xml:space="preserve">44</w:t>
+              <w:t xml:space="preserve">45</w:t>
             </w:r>
           </w:p>
         </w:tc>
@@ -175,12 +175,30 @@
                 <w:b/>
                 <w:bCs/>
               </w:rPr>
+              <w:t xml:space="preserve">r45: closed HRD-015 Obsolete (§11.4.90) — its "Go-scaffold I8 invariant" was superseded by design change (the I8 gate slot was repurposed for the §107 covenant I8a/b/c; the scaffold is verified by the broader test suite). Prior</w:t>
+            </w:r>
+            <w:r>
+              <w:rPr>
+                <w:b/>
+                <w:bCs/>
+              </w:rPr>
+              <w:t xml:space="preserve"> </w:t>
+            </w:r>
+            <w:r>
+              <w:rPr>
+                <w:b/>
+                <w:b/>
+                <w:bCs/>
+                <w:bCs/>
+              </w:rPr>
               <w:t xml:space="preserve">r44: migrated the now-complete HRD-146 (</w:t>
             </w:r>
             <w:r>
               <w:rPr>
                 <w:rStyle w:val="VerbatimChar"/>
                 <w:b/>
+                <w:b/>
+                <w:bCs/>
                 <w:bCs/>
               </w:rPr>
               <w:t xml:space="preserve">pherald listen</w:t>
@@ -188,13 +206,17 @@
             <w:r>
               <w:rPr>
                 <w:b/>
-                <w:bCs/>
-              </w:rPr>
-              <w:t xml:space="preserve"> </w:t>
-            </w:r>
-            <w:r>
-              <w:rPr>
-                <w:b/>
+                <w:b/>
+                <w:bCs/>
+                <w:bCs/>
+              </w:rPr>
+              <w:t xml:space="preserve"> </w:t>
+            </w:r>
+            <w:r>
+              <w:rPr>
+                <w:b/>
+                <w:b/>
+                <w:bCs/>
                 <w:bCs/>
               </w:rPr>
               <w:t xml:space="preserve">dispatch hardening,</w:t>
@@ -202,14 +224,18 @@
             <w:r>
               <w:rPr>
                 <w:b/>
-                <w:bCs/>
-              </w:rPr>
-              <w:t xml:space="preserve"> </w:t>
-            </w:r>
-            <w:r>
-              <w:rPr>
-                <w:rStyle w:val="VerbatimChar"/>
-                <w:b/>
+                <w:b/>
+                <w:bCs/>
+                <w:bCs/>
+              </w:rPr>
+              <w:t xml:space="preserve"> </w:t>
+            </w:r>
+            <w:r>
+              <w:rPr>
+                <w:rStyle w:val="VerbatimChar"/>
+                <w:b/>
+                <w:b/>
+                <w:bCs/>
                 <w:bCs/>
               </w:rPr>
               <w:t xml:space="preserve">a975d8b</w:t>
@@ -217,6 +243,8 @@
             <w:r>
               <w:rPr>
                 <w:b/>
+                <w:b/>
+                <w:bCs/>
                 <w:bCs/>
               </w:rPr>
               <w:t xml:space="preserve">) + HRD-147 (governance dead-letter subscriber,</w:t>
@@ -224,14 +252,18 @@
             <w:r>
               <w:rPr>
                 <w:b/>
-                <w:bCs/>
-              </w:rPr>
-              <w:t xml:space="preserve"> </w:t>
-            </w:r>
-            <w:r>
-              <w:rPr>
-                <w:rStyle w:val="VerbatimChar"/>
-                <w:b/>
+                <w:b/>
+                <w:bCs/>
+                <w:bCs/>
+              </w:rPr>
+              <w:t xml:space="preserve"> </w:t>
+            </w:r>
+            <w:r>
+              <w:rPr>
+                <w:rStyle w:val="VerbatimChar"/>
+                <w:b/>
+                <w:b/>
+                <w:bCs/>
                 <w:bCs/>
               </w:rPr>
               <w:t xml:space="preserve">9ef4be9</w:t>
@@ -239,22 +271,38 @@
             <w:r>
               <w:rPr>
                 <w:b/>
+                <w:b/>
+                <w:bCs/>
                 <w:bCs/>
               </w:rPr>
               <w:t xml:space="preserve">) Issues→Fixed — 15 open.</w:t>
             </w:r>
             <w:r>
-              <w:t xml:space="preserve"> </w:t>
-            </w:r>
-            <w:r>
+              <w:rPr>
+                <w:b/>
+                <w:bCs/>
+              </w:rPr>
+              <w:t xml:space="preserve"> </w:t>
+            </w:r>
+            <w:r>
+              <w:rPr>
+                <w:b/>
+                <w:bCs/>
+              </w:rPr>
               <w:t xml:space="preserve">Prior</w:t>
             </w:r>
             <w:r>
-              <w:t xml:space="preserve"> </w:t>
-            </w:r>
-            <w:r>
-              <w:rPr>
-                <w:b/>
+              <w:rPr>
+                <w:b/>
+                <w:bCs/>
+              </w:rPr>
+              <w:t xml:space="preserve"> </w:t>
+            </w:r>
+            <w:r>
+              <w:rPr>
+                <w:b/>
+                <w:b/>
+                <w:bCs/>
                 <w:bCs/>
               </w:rPr>
               <w:t xml:space="preserve">r43 (v1.0.0 closure-migration — §11.4.19 atomic Issues→Fixed of 51 code-verified HRDs). Re-audited each candidate against committed reality (grep/read the impl + run the test + confirm the e2e invariant + confirm the</w:t>
@@ -262,14 +310,18 @@
             <w:r>
               <w:rPr>
                 <w:b/>
-                <w:bCs/>
-              </w:rPr>
-              <w:t xml:space="preserve"> </w:t>
-            </w:r>
-            <w:r>
-              <w:rPr>
-                <w:rStyle w:val="VerbatimChar"/>
-                <w:b/>
+                <w:b/>
+                <w:bCs/>
+                <w:bCs/>
+              </w:rPr>
+              <w:t xml:space="preserve"> </w:t>
+            </w:r>
+            <w:r>
+              <w:rPr>
+                <w:rStyle w:val="VerbatimChar"/>
+                <w:b/>
+                <w:b/>
+                <w:bCs/>
                 <w:bCs/>
               </w:rPr>
               <w:t xml:space="preserve">docs/qa/&lt;run-id&gt;/</w:t>
@@ -277,248 +329,464 @@
             <w:r>
               <w:rPr>
                 <w:b/>
-                <w:bCs/>
-              </w:rPr>
-              <w:t xml:space="preserve"> </w:t>
-            </w:r>
-            <w:r>
-              <w:rPr>
-                <w:b/>
+                <w:b/>
+                <w:bCs/>
+                <w:bCs/>
+              </w:rPr>
+              <w:t xml:space="preserve"> </w:t>
+            </w:r>
+            <w:r>
+              <w:rPr>
+                <w:b/>
+                <w:b/>
+                <w:bCs/>
                 <w:bCs/>
               </w:rPr>
               <w:t xml:space="preserve">dir) BEFORE migrating; nothing trusted on self-reported status alone.</w:t>
             </w:r>
             <w:r>
-              <w:t xml:space="preserve"> </w:t>
-            </w:r>
-            <w:r>
+              <w:rPr>
+                <w:b/>
+                <w:bCs/>
+              </w:rPr>
+              <w:t xml:space="preserve"> </w:t>
+            </w:r>
+            <w:r>
+              <w:rPr>
+                <w:b/>
+                <w:bCs/>
+              </w:rPr>
               <w:t xml:space="preserve">Migrated to</w:t>
             </w:r>
             <w:r>
-              <w:t xml:space="preserve"> </w:t>
-            </w:r>
-            <w:r>
-              <w:rPr>
-                <w:rStyle w:val="VerbatimChar"/>
+              <w:rPr>
+                <w:b/>
+                <w:bCs/>
+              </w:rPr>
+              <w:t xml:space="preserve"> </w:t>
+            </w:r>
+            <w:r>
+              <w:rPr>
+                <w:rStyle w:val="VerbatimChar"/>
+                <w:b/>
+                <w:bCs/>
               </w:rPr>
               <w:t xml:space="preserve">Fixed.md</w:t>
             </w:r>
             <w:r>
+              <w:rPr>
+                <w:b/>
+                <w:bCs/>
+              </w:rPr>
               <w:t xml:space="preserve">: the 7 flavor constitution bindings HRD-019..025 (bindings tests 7/7 PASS</w:t>
             </w:r>
             <w:r>
-              <w:t xml:space="preserve"> </w:t>
-            </w:r>
-            <w:r>
-              <w:rPr>
-                <w:rStyle w:val="VerbatimChar"/>
+              <w:rPr>
+                <w:b/>
+                <w:bCs/>
+              </w:rPr>
+              <w:t xml:space="preserve"> </w:t>
+            </w:r>
+            <w:r>
+              <w:rPr>
+                <w:rStyle w:val="VerbatimChar"/>
+                <w:b/>
+                <w:bCs/>
               </w:rPr>
               <w:t xml:space="preserve">-race</w:t>
             </w:r>
             <w:r>
+              <w:rPr>
+                <w:b/>
+                <w:bCs/>
+              </w:rPr>
               <w:t xml:space="preserve">; e2e E90-E96 present; per-HRD</w:t>
             </w:r>
             <w:r>
-              <w:t xml:space="preserve"> </w:t>
-            </w:r>
-            <w:r>
-              <w:rPr>
-                <w:rStyle w:val="VerbatimChar"/>
+              <w:rPr>
+                <w:b/>
+                <w:bCs/>
+              </w:rPr>
+              <w:t xml:space="preserve"> </w:t>
+            </w:r>
+            <w:r>
+              <w:rPr>
+                <w:rStyle w:val="VerbatimChar"/>
+                <w:b/>
+                <w:bCs/>
               </w:rPr>
               <w:t xml:space="preserve">docs/qa/</w:t>
             </w:r>
             <w:r>
-              <w:t xml:space="preserve"> </w:t>
-            </w:r>
-            <w:r>
+              <w:rPr>
+                <w:b/>
+                <w:bCs/>
+              </w:rPr>
+              <w:t xml:space="preserve"> </w:t>
+            </w:r>
+            <w:r>
+              <w:rPr>
+                <w:b/>
+                <w:bCs/>
+              </w:rPr>
               <w:t xml:space="preserve">dirs); the entire §43 command catalogue HRD-029..056 (30 commands, all wired into the Cobra root via</w:t>
             </w:r>
             <w:r>
-              <w:t xml:space="preserve"> </w:t>
-            </w:r>
-            <w:r>
-              <w:rPr>
-                <w:rStyle w:val="VerbatimChar"/>
+              <w:rPr>
+                <w:b/>
+                <w:bCs/>
+              </w:rPr>
+              <w:t xml:space="preserve"> </w:t>
+            </w:r>
+            <w:r>
+              <w:rPr>
+                <w:rStyle w:val="VerbatimChar"/>
+                <w:b/>
+                <w:bCs/>
               </w:rPr>
               <w:t xml:space="preserve">registerGitOps</w:t>
             </w:r>
             <w:r>
+              <w:rPr>
+                <w:b/>
+                <w:bCs/>
+              </w:rPr>
               <w:t xml:space="preserve">/</w:t>
             </w:r>
             <w:r>
               <w:rPr>
                 <w:rStyle w:val="VerbatimChar"/>
+                <w:b/>
+                <w:bCs/>
               </w:rPr>
               <w:t xml:space="preserve">registerSysOps</w:t>
             </w:r>
             <w:r>
+              <w:rPr>
+                <w:b/>
+                <w:bCs/>
+              </w:rPr>
               <w:t xml:space="preserve">/etc., cmd-test suites PASS, e2e E97-E122 present, per-HRD</w:t>
             </w:r>
             <w:r>
-              <w:t xml:space="preserve"> </w:t>
-            </w:r>
-            <w:r>
-              <w:rPr>
-                <w:rStyle w:val="VerbatimChar"/>
+              <w:rPr>
+                <w:b/>
+                <w:bCs/>
+              </w:rPr>
+              <w:t xml:space="preserve"> </w:t>
+            </w:r>
+            <w:r>
+              <w:rPr>
+                <w:rStyle w:val="VerbatimChar"/>
+                <w:b/>
+                <w:bCs/>
               </w:rPr>
               <w:t xml:space="preserve">docs/qa/</w:t>
             </w:r>
             <w:r>
-              <w:t xml:space="preserve"> </w:t>
-            </w:r>
-            <w:r>
+              <w:rPr>
+                <w:b/>
+                <w:bCs/>
+              </w:rPr>
+              <w:t xml:space="preserve"> </w:t>
+            </w:r>
+            <w:r>
+              <w:rPr>
+                <w:b/>
+                <w:bCs/>
+              </w:rPr>
               <w:t xml:space="preserve">dirs); the Batch-D</w:t>
             </w:r>
             <w:r>
-              <w:t xml:space="preserve"> </w:t>
-            </w:r>
-            <w:r>
-              <w:rPr>
-                <w:rStyle w:val="VerbatimChar"/>
+              <w:rPr>
+                <w:b/>
+                <w:bCs/>
+              </w:rPr>
+              <w:t xml:space="preserve"> </w:t>
+            </w:r>
+            <w:r>
+              <w:rPr>
+                <w:rStyle w:val="VerbatimChar"/>
+                <w:b/>
+                <w:bCs/>
               </w:rPr>
               <w:t xml:space="preserve">commons_infra.pgxTaskRepository</w:t>
             </w:r>
             <w:r>
-              <w:t xml:space="preserve"> </w:t>
-            </w:r>
-            <w:r>
+              <w:rPr>
+                <w:b/>
+                <w:bCs/>
+              </w:rPr>
+              <w:t xml:space="preserve"> </w:t>
+            </w:r>
+            <w:r>
+              <w:rPr>
+                <w:b/>
+                <w:bCs/>
+              </w:rPr>
               <w:t xml:space="preserve">ops HRD-085..089 (all 15 methods are real impls not</w:t>
             </w:r>
             <w:r>
-              <w:t xml:space="preserve"> </w:t>
-            </w:r>
-            <w:r>
-              <w:rPr>
-                <w:rStyle w:val="VerbatimChar"/>
+              <w:rPr>
+                <w:b/>
+                <w:bCs/>
+              </w:rPr>
+              <w:t xml:space="preserve"> </w:t>
+            </w:r>
+            <w:r>
+              <w:rPr>
+                <w:rStyle w:val="VerbatimChar"/>
+                <w:b/>
+                <w:bCs/>
               </w:rPr>
               <w:t xml:space="preserve">ErrUnsupported</w:t>
             </w:r>
             <w:r>
+              <w:rPr>
+                <w:b/>
+                <w:bCs/>
+              </w:rPr>
               <w:t xml:space="preserve">, migration</w:t>
             </w:r>
             <w:r>
-              <w:t xml:space="preserve"> </w:t>
-            </w:r>
-            <w:r>
-              <w:rPr>
-                <w:rStyle w:val="VerbatimChar"/>
+              <w:rPr>
+                <w:b/>
+                <w:bCs/>
+              </w:rPr>
+              <w:t xml:space="preserve"> </w:t>
+            </w:r>
+            <w:r>
+              <w:rPr>
+                <w:rStyle w:val="VerbatimChar"/>
+                <w:b/>
+                <w:bCs/>
               </w:rPr>
               <w:t xml:space="preserve">000013_task_resource_snapshots</w:t>
             </w:r>
             <w:r>
-              <w:t xml:space="preserve"> </w:t>
-            </w:r>
-            <w:r>
+              <w:rPr>
+                <w:b/>
+                <w:bCs/>
+              </w:rPr>
+              <w:t xml:space="preserve"> </w:t>
+            </w:r>
+            <w:r>
+              <w:rPr>
+                <w:b/>
+                <w:bCs/>
+              </w:rPr>
               <w:t xml:space="preserve">present, e2e E123,</w:t>
             </w:r>
             <w:r>
-              <w:t xml:space="preserve"> </w:t>
-            </w:r>
-            <w:r>
-              <w:rPr>
-                <w:rStyle w:val="VerbatimChar"/>
+              <w:rPr>
+                <w:b/>
+                <w:bCs/>
+              </w:rPr>
+              <w:t xml:space="preserve"> </w:t>
+            </w:r>
+            <w:r>
+              <w:rPr>
+                <w:rStyle w:val="VerbatimChar"/>
+                <w:b/>
+                <w:bCs/>
               </w:rPr>
               <w:t xml:space="preserve">docs/qa/HRD-085-089-*</w:t>
             </w:r>
             <w:r>
+              <w:rPr>
+                <w:b/>
+                <w:bCs/>
+              </w:rPr>
               <w:t xml:space="preserve">); Wave 7 HRD-116/118/119/120/121 (qaherald Slack client + e2e E124-E131 + paired §1.1 gate</w:t>
             </w:r>
             <w:r>
-              <w:t xml:space="preserve"> </w:t>
-            </w:r>
-            <w:r>
-              <w:rPr>
-                <w:rStyle w:val="VerbatimChar"/>
+              <w:rPr>
+                <w:b/>
+                <w:bCs/>
+              </w:rPr>
+              <w:t xml:space="preserve"> </w:t>
+            </w:r>
+            <w:r>
+              <w:rPr>
+                <w:rStyle w:val="VerbatimChar"/>
+                <w:b/>
+                <w:bCs/>
               </w:rPr>
               <w:t xml:space="preserve">tests/test_wave7_mutation_meta.sh</w:t>
             </w:r>
             <w:r>
-              <w:t xml:space="preserve"> </w:t>
-            </w:r>
-            <w:r>
+              <w:rPr>
+                <w:b/>
+                <w:bCs/>
+              </w:rPr>
+              <w:t xml:space="preserve"> </w:t>
+            </w:r>
+            <w:r>
+              <w:rPr>
+                <w:b/>
+                <w:bCs/>
+              </w:rPr>
               <w:t xml:space="preserve">+ multi-channel stress/chaos + operator guide — all hermetic tests PASS); and the ATMOSphere features HRD-148/149/151/152/153/154 (</w:t>
             </w:r>
             <w:r>
               <w:rPr>
                 <w:rStyle w:val="VerbatimChar"/>
+                <w:b/>
+                <w:bCs/>
               </w:rPr>
               <w:t xml:space="preserve">commons_workable</w:t>
             </w:r>
             <w:r>
+              <w:rPr>
+                <w:b/>
+                <w:bCs/>
+              </w:rPr>
               <w:t xml:space="preserve">+</w:t>
             </w:r>
             <w:r>
               <w:rPr>
                 <w:rStyle w:val="VerbatimChar"/>
+                <w:b/>
+                <w:bCs/>
               </w:rPr>
               <w:t xml:space="preserve">commons_watch</w:t>
             </w:r>
             <w:r>
-              <w:t xml:space="preserve"> </w:t>
-            </w:r>
-            <w:r>
+              <w:rPr>
+                <w:b/>
+                <w:bCs/>
+              </w:rPr>
+              <w:t xml:space="preserve"> </w:t>
+            </w:r>
+            <w:r>
+              <w:rPr>
+                <w:b/>
+                <w:bCs/>
+              </w:rPr>
               <w:t xml:space="preserve">modules build+test PASS, workflow bridge + inbound action registry +</w:t>
             </w:r>
             <w:r>
-              <w:t xml:space="preserve"> </w:t>
-            </w:r>
-            <w:r>
-              <w:rPr>
-                <w:rStyle w:val="VerbatimChar"/>
+              <w:rPr>
+                <w:b/>
+                <w:bCs/>
+              </w:rPr>
+              <w:t xml:space="preserve"> </w:t>
+            </w:r>
+            <w:r>
+              <w:rPr>
+                <w:rStyle w:val="VerbatimChar"/>
+                <w:b/>
+                <w:bCs/>
               </w:rPr>
               <w:t xml:space="preserve">pherald watch</w:t>
             </w:r>
             <w:r>
-              <w:t xml:space="preserve"> </w:t>
-            </w:r>
-            <w:r>
+              <w:rPr>
+                <w:b/>
+                <w:bCs/>
+              </w:rPr>
+              <w:t xml:space="preserve"> </w:t>
+            </w:r>
+            <w:r>
+              <w:rPr>
+                <w:b/>
+                <w:bCs/>
+              </w:rPr>
               <w:t xml:space="preserve">daemon + quiet-hours resolver all wired, e2e E139</w:t>
             </w:r>
             <w:r>
-              <w:t xml:space="preserve"> </w:t>
-            </w:r>
-            <w:r>
-              <w:rPr>
-                <w:rStyle w:val="VerbatimChar"/>
+              <w:rPr>
+                <w:b/>
+                <w:bCs/>
+              </w:rPr>
+              <w:t xml:space="preserve"> </w:t>
+            </w:r>
+            <w:r>
+              <w:rPr>
+                <w:rStyle w:val="VerbatimChar"/>
+                <w:b/>
+                <w:bCs/>
               </w:rPr>
               <w:t xml:space="preserve">TestRunWatch_EndToEndOutbound</w:t>
             </w:r>
             <w:r>
-              <w:t xml:space="preserve"> </w:t>
-            </w:r>
-            <w:r>
+              <w:rPr>
+                <w:b/>
+                <w:bCs/>
+              </w:rPr>
+              <w:t xml:space="preserve"> </w:t>
+            </w:r>
+            <w:r>
+              <w:rPr>
+                <w:b/>
+                <w:bCs/>
+              </w:rPr>
               <w:t xml:space="preserve">PASS hermetic). Issues count 43→17→15 (HRD-146/147 also closed in r44).</w:t>
             </w:r>
             <w:r>
-              <w:t xml:space="preserve"> </w:t>
-            </w:r>
-            <w:r>
-              <w:rPr>
-                <w:b/>
+              <w:rPr>
+                <w:b/>
+                <w:bCs/>
+              </w:rPr>
+              <w:t xml:space="preserve"> </w:t>
+            </w:r>
+            <w:r>
+              <w:rPr>
+                <w:b/>
+                <w:b/>
+                <w:bCs/>
                 <w:bCs/>
               </w:rPr>
               <w:t xml:space="preserve">DELIBERATELY LEFT OPEN (evidence-gated, NOT migrated):</w:t>
             </w:r>
             <w:r>
-              <w:t xml:space="preserve"> </w:t>
-            </w:r>
-            <w:r>
+              <w:rPr>
+                <w:b/>
+                <w:bCs/>
+              </w:rPr>
+              <w:t xml:space="preserve"> </w:t>
+            </w:r>
+            <w:r>
+              <w:rPr>
+                <w:b/>
+                <w:bCs/>
+              </w:rPr>
               <w:t xml:space="preserve">HRD-115 (Slack channel adapter — user-visible external-service feature whose closure is operator-gated on LIVE</w:t>
             </w:r>
             <w:r>
-              <w:t xml:space="preserve"> </w:t>
-            </w:r>
-            <w:r>
-              <w:rPr>
-                <w:rStyle w:val="VerbatimChar"/>
+              <w:rPr>
+                <w:b/>
+                <w:bCs/>
+              </w:rPr>
+              <w:t xml:space="preserve"> </w:t>
+            </w:r>
+            <w:r>
+              <w:rPr>
+                <w:rStyle w:val="VerbatimChar"/>
+                <w:b/>
+                <w:bCs/>
               </w:rPr>
               <w:t xml:space="preserve">docs/qa/HRD-115-LIVE-*/</w:t>
             </w:r>
             <w:r>
-              <w:t xml:space="preserve"> </w:t>
-            </w:r>
-            <w:r>
-              <w:t xml:space="preserve">round-trip evidence per §107.x; only hermetic httptest transcript exists, E127 LIVE-Slack is SKIP-with-reason — closing it would be a §107 PASS-bluff); HRD-117 (spec V3 doc-only — §106 spec-change discipline, not a code-closure); HRD-150/155/156/157/158 (ATMOSphere externally-gated: constitution-tool upstream, MTProto live creds, cross-repo push); HRD-131 (SQLite SSoT migration Phase 2 externally blocked); HRD-146/147/081/008/015 (not-started / upstream / operator-validation); HRD-143/144/145 (already Obsolete). Prior r42 (ATMOSphere↔Herald integration DEPLOYED across all repos). Cross-repo push complete:** (1) HRD-155 — HelixConstitution workable-items parser extended for ATMOSphere's</w:t>
+              <w:rPr>
+                <w:b/>
+                <w:bCs/>
+              </w:rPr>
+              <w:t xml:space="preserve"> </w:t>
+            </w:r>
+            <w:r>
+              <w:rPr>
+                <w:b/>
+                <w:bCs/>
+              </w:rPr>
+              <w:t xml:space="preserve">round-trip evidence per §107.x; only hermetic httptest transcript exists, E127 LIVE-Slack is SKIP-with-reason — closing it would be a §107 PASS-bluff); HRD-117 (spec V3 doc-only — §106 spec-change discipline, not a code-closure); HRD-150/155/156/157/158 (ATMOSphere externally-gated: constitution-tool upstream, MTProto live creds, cross-repo push); HRD-131 (SQLite SSoT migration Phase 2 externally blocked); HRD-146/147/081/008/015 (not-started / upstream / operator-validation); HRD-143/144/145 (already Obsolete). Prior r42 (ATMOSphere↔Herald integration DEPLOYED across all repos). Cross-repo push complete:</w:t>
+            </w:r>
+            <w:r>
+              <w:t xml:space="preserve"> </w:t>
+            </w:r>
+            <w:r>
+              <w:t xml:space="preserve">(1) HRD-155 — HelixConstitution workable-items parser extended for ATMOSphere's</w:t>
             </w:r>
             <w:r>
               <w:t xml:space="preserve"> </w:t>
@@ -4372,7 +4640,7 @@
               <w:pStyle w:val="Compact"/>
             </w:pPr>
             <w:r>
-              <w:t xml:space="preserve">open</w:t>
+              <w:t xml:space="preserve">Obsolete</w:t>
             </w:r>
           </w:p>
         </w:tc>
@@ -4394,7 +4662,194 @@
               <w:pStyle w:val="Compact"/>
             </w:pPr>
             <w:r>
-              <w:t xml:space="preserve">Inheritance gate I8 invariants for Go scaffold (go.work + commons/types.go + null adapter test passes)</w:t>
+              <w:t xml:space="preserve">Inheritance gate I8 invariants for Go scaffold (go.work + commons/types.go + null adapter test passes) — superseded by design change.</w:t>
+            </w:r>
+            <w:r>
+              <w:t xml:space="preserve"> </w:t>
+            </w:r>
+            <w:r>
+              <w:rPr>
+                <w:b/>
+                <w:bCs/>
+              </w:rPr>
+              <w:t xml:space="preserve">Obsolete-Details:</w:t>
+            </w:r>
+            <w:r>
+              <w:t xml:space="preserve"> </w:t>
+            </w:r>
+            <w:r>
+              <w:t xml:space="preserve">Since 2026-05-30; Reason=superseded-by-design-change; Superseding-item=the inheritance-gate</w:t>
+            </w:r>
+            <w:r>
+              <w:t xml:space="preserve"> </w:t>
+            </w:r>
+            <w:r>
+              <w:rPr>
+                <w:rStyle w:val="VerbatimChar"/>
+              </w:rPr>
+              <w:t xml:space="preserve">I8</w:t>
+            </w:r>
+            <w:r>
+              <w:t xml:space="preserve"> </w:t>
+            </w:r>
+            <w:r>
+              <w:t xml:space="preserve">slot was repurposed for the §107 end-user-usability covenant (</w:t>
+            </w:r>
+            <w:r>
+              <w:rPr>
+                <w:rStyle w:val="VerbatimChar"/>
+              </w:rPr>
+              <w:t xml:space="preserve">I8a</w:t>
+            </w:r>
+            <w:r>
+              <w:t xml:space="preserve">/</w:t>
+            </w:r>
+            <w:r>
+              <w:rPr>
+                <w:rStyle w:val="VerbatimChar"/>
+              </w:rPr>
+              <w:t xml:space="preserve">I8b</w:t>
+            </w:r>
+            <w:r>
+              <w:t xml:space="preserve">/</w:t>
+            </w:r>
+            <w:r>
+              <w:rPr>
+                <w:rStyle w:val="VerbatimChar"/>
+              </w:rPr>
+              <w:t xml:space="preserve">I8c</w:t>
+            </w:r>
+            <w:r>
+              <w:t xml:space="preserve"> </w:t>
+            </w:r>
+            <w:r>
+              <w:t xml:space="preserve">in</w:t>
+            </w:r>
+            <w:r>
+              <w:t xml:space="preserve"> </w:t>
+            </w:r>
+            <w:r>
+              <w:rPr>
+                <w:rStyle w:val="VerbatimChar"/>
+              </w:rPr>
+              <w:t xml:space="preserve">tests/test_constitution_inheritance.sh:133-137</w:t>
+            </w:r>
+            <w:r>
+              <w:t xml:space="preserve">), and the Go-scaffold verification HRD-015 requested is now covered by the broader anti-bluff test suite rather than a dedicated gate invariant; Triple-check evidence: (a)</w:t>
+            </w:r>
+            <w:r>
+              <w:t xml:space="preserve"> </w:t>
+            </w:r>
+            <w:r>
+              <w:rPr>
+                <w:rStyle w:val="VerbatimChar"/>
+              </w:rPr>
+              <w:t xml:space="preserve">grep -nE 'I8[abc]' tests/test_constitution_inheritance.sh</w:t>
+            </w:r>
+            <w:r>
+              <w:t xml:space="preserve"> </w:t>
+            </w:r>
+            <w:r>
+              <w:t xml:space="preserve">shows the three I8a/b/c checks assert the §107 covenant anchors in CLAUDE.md/AGENTS.md/HERALD_CONSTITUTION.md — NOT the Go-scaffold (the</w:t>
+            </w:r>
+            <w:r>
+              <w:t xml:space="preserve"> </w:t>
+            </w:r>
+            <w:r>
+              <w:rPr>
+                <w:rStyle w:val="VerbatimChar"/>
+              </w:rPr>
+              <w:t xml:space="preserve">I8</w:t>
+            </w:r>
+            <w:r>
+              <w:t xml:space="preserve"> </w:t>
+            </w:r>
+            <w:r>
+              <w:t xml:space="preserve">number was reassigned), (b) the null adapter is a full tested adapter (</w:t>
+            </w:r>
+            <w:r>
+              <w:rPr>
+                <w:rStyle w:val="VerbatimChar"/>
+              </w:rPr>
+              <w:t xml:space="preserve">commons_messaging/channels/null/</w:t>
+            </w:r>
+            <w:r>
+              <w:t xml:space="preserve"> </w:t>
+            </w:r>
+            <w:r>
+              <w:t xml:space="preserve">per CLAUDE.md) and</w:t>
+            </w:r>
+            <w:r>
+              <w:t xml:space="preserve"> </w:t>
+            </w:r>
+            <w:r>
+              <w:rPr>
+                <w:rStyle w:val="VerbatimChar"/>
+              </w:rPr>
+              <w:t xml:space="preserve">go.work</w:t>
+            </w:r>
+            <w:r>
+              <w:t xml:space="preserve"> </w:t>
+            </w:r>
+            <w:r>
+              <w:t xml:space="preserve">+</w:t>
+            </w:r>
+            <w:r>
+              <w:t xml:space="preserve"> </w:t>
+            </w:r>
+            <w:r>
+              <w:rPr>
+                <w:rStyle w:val="VerbatimChar"/>
+              </w:rPr>
+              <w:t xml:space="preserve">commons/types.go</w:t>
+            </w:r>
+            <w:r>
+              <w:t xml:space="preserve"> </w:t>
+            </w:r>
+            <w:r>
+              <w:t xml:space="preserve">exist and build green — the 2026-05-30 green-baseline reported 18/18 Go modules</w:t>
+            </w:r>
+            <w:r>
+              <w:t xml:space="preserve"> </w:t>
+            </w:r>
+            <w:r>
+              <w:rPr>
+                <w:rStyle w:val="VerbatimChar"/>
+              </w:rPr>
+              <w:t xml:space="preserve">ok</w:t>
+            </w:r>
+            <w:r>
+              <w:t xml:space="preserve"> </w:t>
+            </w:r>
+            <w:r>
+              <w:t xml:space="preserve">+ inheritance gate 15 PASS / 0 FAIL, (c) runtime: HRD-015's intent (verify the Go scaffold passes) is continuously satisfied by</w:t>
+            </w:r>
+            <w:r>
+              <w:t xml:space="preserve"> </w:t>
+            </w:r>
+            <w:r>
+              <w:rPr>
+                <w:rStyle w:val="VerbatimChar"/>
+              </w:rPr>
+              <w:t xml:space="preserve">go test ./...</w:t>
+            </w:r>
+            <w:r>
+              <w:t xml:space="preserve"> </w:t>
+            </w:r>
+            <w:r>
+              <w:t xml:space="preserve">+</w:t>
+            </w:r>
+            <w:r>
+              <w:t xml:space="preserve"> </w:t>
+            </w:r>
+            <w:r>
+              <w:rPr>
+                <w:rStyle w:val="VerbatimChar"/>
+              </w:rPr>
+              <w:t xml:space="preserve">scripts/e2e_bluff_hunt.sh</w:t>
+            </w:r>
+            <w:r>
+              <w:t xml:space="preserve">, so a separate I8 scaffold invariant is redundant. Action: closed Obsolete; no code change.</w:t>
             </w:r>
           </w:p>
         </w:tc>
@@ -4416,18 +4871,18 @@
               <w:pStyle w:val="Compact"/>
             </w:pPr>
             <w:r>
-              <w:t xml:space="preserve">2026-05-20</w:t>
-            </w:r>
-          </w:p>
-        </w:tc>
-        <w:tc>
-          <w:tcPr/>
-          <w:p>
-            <w:pPr>
-              <w:pStyle w:val="Compact"/>
-            </w:pPr>
-            <w:r>
-              <w:t xml:space="preserve">spec V3 §40 + gate I7 pattern; Catalogue-Check: no-match (2026-05-20)</w:t>
+              <w:t xml:space="preserve">2026-05-30</w:t>
+            </w:r>
+          </w:p>
+        </w:tc>
+        <w:tc>
+          <w:tcPr/>
+          <w:p>
+            <w:pPr>
+              <w:pStyle w:val="Compact"/>
+            </w:pPr>
+            <w:r>
+              <w:t xml:space="preserve">spec V3 §40 + gate I7 pattern; superseded by the §107 I8a/b/c gate + the broader test suite; Catalogue-Check: n/a (Obsolete classification, not new code)</w:t>
             </w:r>
           </w:p>
         </w:tc>

</xml_diff>